<commit_message>
Illustrate POMS order-to-cash guide with current screenshots
</commit_message>
<xml_diff>
--- a/docs/Phaeno-POMS-Order-to-Cash-Guide.docx
+++ b/docs/Phaeno-POMS-Order-to-Cash-Guide.docx
@@ -510,17 +510,12 @@
             <w:shd w:fill="FFFFFF"/>
           </w:tcPr>
           <w:p>
-            <w:pPr>
-              <w:spacing w:after="60" w:line="240" w:lineRule="auto"/>
-              <w:jc w:val="center"/>
-            </w:pPr>
             <w:r>
               <w:rPr>
-                <w:b w:val="0"/>
-                <w:color w:val="000000"/>
-                <w:sz w:val="20"/>
+                <w:rFonts w:ascii="Calibri" w:hAnsi="Calibri"/>
+                <w:sz w:val="18"/>
               </w:rPr>
-              <w:t>3</w:t>
+              <w:t>3–4</w:t>
             </w:r>
           </w:p>
         </w:tc>
@@ -576,17 +571,12 @@
             <w:shd w:fill="F3F6F8"/>
           </w:tcPr>
           <w:p>
-            <w:pPr>
-              <w:spacing w:after="60" w:line="240" w:lineRule="auto"/>
-              <w:jc w:val="center"/>
-            </w:pPr>
             <w:r>
               <w:rPr>
-                <w:b w:val="0"/>
-                <w:color w:val="000000"/>
-                <w:sz w:val="20"/>
+                <w:rFonts w:ascii="Calibri" w:hAnsi="Calibri"/>
+                <w:sz w:val="18"/>
               </w:rPr>
-              <w:t>4</w:t>
+              <w:t>5</w:t>
             </w:r>
           </w:p>
         </w:tc>
@@ -642,17 +632,12 @@
             <w:shd w:fill="FFFFFF"/>
           </w:tcPr>
           <w:p>
-            <w:pPr>
-              <w:spacing w:after="60" w:line="240" w:lineRule="auto"/>
-              <w:jc w:val="center"/>
-            </w:pPr>
             <w:r>
               <w:rPr>
-                <w:b w:val="0"/>
-                <w:color w:val="000000"/>
-                <w:sz w:val="20"/>
+                <w:rFonts w:ascii="Calibri" w:hAnsi="Calibri"/>
+                <w:sz w:val="18"/>
               </w:rPr>
-              <w:t>5</w:t>
+              <w:t>6–8</w:t>
             </w:r>
           </w:p>
         </w:tc>
@@ -708,17 +693,12 @@
             <w:shd w:fill="F3F6F8"/>
           </w:tcPr>
           <w:p>
-            <w:pPr>
-              <w:spacing w:after="60" w:line="240" w:lineRule="auto"/>
-              <w:jc w:val="center"/>
-            </w:pPr>
             <w:r>
               <w:rPr>
-                <w:b w:val="0"/>
-                <w:color w:val="000000"/>
-                <w:sz w:val="20"/>
+                <w:rFonts w:ascii="Calibri" w:hAnsi="Calibri"/>
+                <w:sz w:val="18"/>
               </w:rPr>
-              <w:t>6</w:t>
+              <w:t>9</w:t>
             </w:r>
           </w:p>
         </w:tc>
@@ -774,17 +754,12 @@
             <w:shd w:fill="FFFFFF"/>
           </w:tcPr>
           <w:p>
-            <w:pPr>
-              <w:spacing w:after="60" w:line="240" w:lineRule="auto"/>
-              <w:jc w:val="center"/>
-            </w:pPr>
             <w:r>
               <w:rPr>
-                <w:b w:val="0"/>
-                <w:color w:val="000000"/>
-                <w:sz w:val="20"/>
+                <w:rFonts w:ascii="Calibri" w:hAnsi="Calibri"/>
+                <w:sz w:val="18"/>
               </w:rPr>
-              <w:t>7</w:t>
+              <w:t>10–11</w:t>
             </w:r>
           </w:p>
         </w:tc>
@@ -840,17 +815,12 @@
             <w:shd w:fill="F3F6F8"/>
           </w:tcPr>
           <w:p>
-            <w:pPr>
-              <w:spacing w:after="60" w:line="240" w:lineRule="auto"/>
-              <w:jc w:val="center"/>
-            </w:pPr>
             <w:r>
               <w:rPr>
-                <w:b w:val="0"/>
-                <w:color w:val="000000"/>
-                <w:sz w:val="20"/>
+                <w:rFonts w:ascii="Calibri" w:hAnsi="Calibri"/>
+                <w:sz w:val="18"/>
               </w:rPr>
-              <w:t>8–9</w:t>
+              <w:t>12–14</w:t>
             </w:r>
           </w:p>
         </w:tc>
@@ -906,17 +876,12 @@
             <w:shd w:fill="FFFFFF"/>
           </w:tcPr>
           <w:p>
-            <w:pPr>
-              <w:spacing w:after="60" w:line="240" w:lineRule="auto"/>
-              <w:jc w:val="center"/>
-            </w:pPr>
             <w:r>
               <w:rPr>
-                <w:b w:val="0"/>
-                <w:color w:val="000000"/>
-                <w:sz w:val="20"/>
+                <w:rFonts w:ascii="Calibri" w:hAnsi="Calibri"/>
+                <w:sz w:val="18"/>
               </w:rPr>
-              <w:t>10</w:t>
+              <w:t>15</w:t>
             </w:r>
           </w:p>
         </w:tc>
@@ -972,17 +937,12 @@
             <w:shd w:fill="F3F6F8"/>
           </w:tcPr>
           <w:p>
-            <w:pPr>
-              <w:spacing w:after="60" w:line="240" w:lineRule="auto"/>
-              <w:jc w:val="center"/>
-            </w:pPr>
             <w:r>
               <w:rPr>
-                <w:b w:val="0"/>
-                <w:color w:val="000000"/>
-                <w:sz w:val="20"/>
+                <w:rFonts w:ascii="Calibri" w:hAnsi="Calibri"/>
+                <w:sz w:val="18"/>
               </w:rPr>
-              <w:t>11–12</w:t>
+              <w:t>16–18</w:t>
             </w:r>
           </w:p>
         </w:tc>
@@ -1038,17 +998,12 @@
             <w:shd w:fill="FFFFFF"/>
           </w:tcPr>
           <w:p>
-            <w:pPr>
-              <w:spacing w:after="60" w:line="240" w:lineRule="auto"/>
-              <w:jc w:val="center"/>
-            </w:pPr>
             <w:r>
               <w:rPr>
-                <w:b w:val="0"/>
-                <w:color w:val="000000"/>
-                <w:sz w:val="20"/>
+                <w:rFonts w:ascii="Calibri" w:hAnsi="Calibri"/>
+                <w:sz w:val="18"/>
               </w:rPr>
-              <w:t>13</w:t>
+              <w:t>19</w:t>
             </w:r>
           </w:p>
         </w:tc>
@@ -1104,17 +1059,12 @@
             <w:shd w:fill="F3F6F8"/>
           </w:tcPr>
           <w:p>
-            <w:pPr>
-              <w:spacing w:after="60" w:line="240" w:lineRule="auto"/>
-              <w:jc w:val="center"/>
-            </w:pPr>
             <w:r>
               <w:rPr>
-                <w:b w:val="0"/>
-                <w:color w:val="000000"/>
-                <w:sz w:val="20"/>
+                <w:rFonts w:ascii="Calibri" w:hAnsi="Calibri"/>
+                <w:sz w:val="18"/>
               </w:rPr>
-              <w:t>14–16</w:t>
+              <w:t>20–25</w:t>
             </w:r>
           </w:p>
         </w:tc>
@@ -1311,6 +1261,58 @@
     </w:p>
     <w:p>
       <w:pPr>
+        <w:keepNext/>
+        <w:spacing w:before="160" w:after="0" w:line="240" w:lineRule="auto"/>
+        <w:jc w:val="center"/>
+      </w:pPr>
+      <w:r>
+        <w:drawing>
+          <wp:inline xmlns:a="http://schemas.openxmlformats.org/drawingml/2006/main" xmlns:pic="http://schemas.openxmlformats.org/drawingml/2006/picture">
+            <wp:extent cx="5806440" cy="5413651"/>
+            <wp:docPr id="10" name="Picture 10" descr="Edit order defaults dialog with quote-validity days, the supported exact-roster and Portal-delivery flow, required submission instructions, and Save changes." title="Edit order defaults maintains shared quote validity and submission instructions. These defaults support future orders; this is not a new-order form."/>
+            <wp:cNvGraphicFramePr>
+              <a:graphicFrameLocks noChangeAspect="1"/>
+            </wp:cNvGraphicFramePr>
+            <a:graphic>
+              <a:graphicData uri="http://schemas.openxmlformats.org/drawingml/2006/picture">
+                <pic:pic>
+                  <pic:nvPicPr>
+                    <pic:cNvPr id="0" name="03-order-defaults-final.png"/>
+                    <pic:cNvPicPr/>
+                  </pic:nvPicPr>
+                  <pic:blipFill>
+                    <a:blip r:embed="rId19"/>
+                    <a:srcRect l="32218" t="15011" r="32218" b="15011"/>
+                    <a:stretch>
+                      <a:fillRect/>
+                    </a:stretch>
+                  </pic:blipFill>
+                  <pic:spPr>
+                    <a:xfrm>
+                      <a:off x="0" y="0"/>
+                      <a:ext cx="5806440" cy="5413651"/>
+                    </a:xfrm>
+                    <a:prstGeom prst="rect"/>
+                  </pic:spPr>
+                </pic:pic>
+              </a:graphicData>
+            </a:graphic>
+          </wp:inline>
+        </w:drawing>
+      </w:r>
+    </w:p>
+    <w:p>
+      <w:pPr>
+        <w:pStyle w:val="Caption"/>
+        <w:keepNext w:val="0"/>
+        <w:keepLines/>
+      </w:pPr>
+      <w:r>
+        <w:t>Figure 1. Edit order defaults maintains shared quote validity and submission instructions. These defaults support future orders; this is not a new-order form.</w:t>
+      </w:r>
+    </w:p>
+    <w:p>
+      <w:pPr>
         <w:pStyle w:val="Heading1"/>
         <w:pageBreakBefore/>
       </w:pPr>
@@ -1443,8 +1445,22 @@
     </w:p>
     <w:p>
       <w:pPr>
+        <w:keepNext w:val="0"/>
+        <w:spacing w:before="0" w:after="0" w:line="20" w:lineRule="exact"/>
+        <w:sectPr>
+          <w:type w:val="nextPage"/>
+          <w:footerReference w:type="default" r:id="rId9"/>
+          <w:pgSz w:w="12240" w:h="15840" w:orient="portrait"/>
+          <w:pgMar w:top="1037" w:right="1181" w:bottom="1037" w:left="1181" w:header="403" w:footer="432" w:gutter="0"/>
+          <w:cols w:space="720"/>
+          <w:docGrid w:linePitch="360"/>
+        </w:sectPr>
+      </w:pPr>
+    </w:p>
+    <w:p>
+      <w:pPr>
         <w:pStyle w:val="Heading1"/>
-        <w:pageBreakBefore/>
+        <w:pageBreakBefore w:val="0"/>
       </w:pPr>
       <w:r>
         <w:t>Start paid work in Order intake</w:t>
@@ -1457,6 +1473,97 @@
     </w:p>
     <w:p>
       <w:pPr>
+        <w:keepNext/>
+        <w:spacing w:before="160" w:after="0" w:line="240" w:lineRule="auto"/>
+        <w:jc w:val="center"/>
+      </w:pPr>
+      <w:r>
+        <w:drawing>
+          <wp:inline xmlns:a="http://schemas.openxmlformats.org/drawingml/2006/main" xmlns:pic="http://schemas.openxmlformats.org/drawingml/2006/picture">
+            <wp:extent cx="8741664" cy="2136851"/>
+            <wp:docPr id="9" name="Picture 9" descr="Order operations overview showing Commercial order intake, the explanation of pricing requests and approved handoffs, and the New Customer order button." title="Order intake is the shared starting point for paid work. New Customer order opens the pricing request form."/>
+            <wp:cNvGraphicFramePr>
+              <a:graphicFrameLocks noChangeAspect="1"/>
+            </wp:cNvGraphicFramePr>
+            <a:graphic>
+              <a:graphicData uri="http://schemas.openxmlformats.org/drawingml/2006/picture">
+                <pic:pic>
+                  <pic:nvPicPr>
+                    <pic:cNvPr id="0" name="01-order-intake.png"/>
+                    <pic:cNvPicPr/>
+                  </pic:nvPicPr>
+                  <pic:blipFill>
+                    <a:blip r:embed="rId18"/>
+                    <a:srcRect l="0" t="0" r="0" b="38627"/>
+                    <a:stretch>
+                      <a:fillRect/>
+                    </a:stretch>
+                  </pic:blipFill>
+                  <pic:spPr>
+                    <a:xfrm>
+                      <a:off x="0" y="0"/>
+                      <a:ext cx="8741664" cy="2136851"/>
+                    </a:xfrm>
+                    <a:prstGeom prst="rect"/>
+                  </pic:spPr>
+                </pic:pic>
+              </a:graphicData>
+            </a:graphic>
+          </wp:inline>
+        </w:drawing>
+      </w:r>
+    </w:p>
+    <w:p>
+      <w:pPr>
+        <w:pStyle w:val="Caption"/>
+        <w:keepNext w:val="0"/>
+        <w:keepLines/>
+      </w:pPr>
+      <w:r>
+        <w:t>Figure 2. Order intake is the shared starting point for paid work. New Customer order opens the pricing request form.</w:t>
+      </w:r>
+    </w:p>
+    <w:p>
+      <w:pPr>
+        <w:pStyle w:val="ListNumber"/>
+        <w:keepNext/>
+        <w:numPr>
+          <w:ilvl w:val="0"/>
+          <w:numId w:val="63"/>
+        </w:numPr>
+      </w:pPr>
+      <w:r>
+        <w:t>Choose New Customer order, or Start Customer order beside an eligible approved CRM handoff. Search by canonical Company name and select the correct Customer. A handoff retains its approved Company and request context.</w:t>
+      </w:r>
+    </w:p>
+    <w:p>
+      <w:pPr>
+        <w:pStyle w:val="ListNumber"/>
+        <w:keepNext/>
+        <w:numPr>
+          <w:ilvl w:val="0"/>
+          <w:numId w:val="63"/>
+        </w:numPr>
+      </w:pPr>
+      <w:r>
+        <w:t>Enter a recognizable unique Job name, biological-source groups and their sample counts, shared storage requirements, safety declaration and Customer-safe notes. The group total is the committed specimen quantity for pricing.</w:t>
+      </w:r>
+    </w:p>
+    <w:p>
+      <w:pPr>
+        <w:pStyle w:val="ListNumber"/>
+        <w:keepNext/>
+        <w:numPr>
+          <w:ilvl w:val="0"/>
+          <w:numId w:val="63"/>
+        </w:numPr>
+      </w:pPr>
+      <w:r>
+        <w:t>If Sales discussed a price, choose Propose a price and enter the proposed USD price per specimen with optional Customer-safe context. A proposal remains part of the request; it is not an issued quote or authorization to begin laboratory work.</w:t>
+      </w:r>
+    </w:p>
+    <w:p>
+      <w:pPr>
         <w:pStyle w:val="ListNumber"/>
         <w:numPr>
           <w:ilvl w:val="0"/>
@@ -1464,48 +1571,79 @@
         </w:numPr>
       </w:pPr>
       <w:r>
-        <w:t>Choose New Customer order, or Start Customer order beside an eligible approved CRM handoff. Search by canonical Company name and select the correct Customer. A handoff retains its approved Company and request context.</w:t>
-      </w:r>
-    </w:p>
-    <w:p>
-      <w:pPr>
-        <w:pStyle w:val="ListNumber"/>
-        <w:numPr>
-          <w:ilvl w:val="0"/>
-          <w:numId w:val="63"/>
-        </w:numPr>
-      </w:pPr>
-      <w:r>
-        <w:t>Enter a recognizable unique Job name, biological-source groups and their sample counts, shared storage requirements, safety declaration and Customer-safe notes. The group total is the committed specimen quantity for pricing.</w:t>
-      </w:r>
-    </w:p>
-    <w:p>
-      <w:pPr>
-        <w:pStyle w:val="ListNumber"/>
-        <w:numPr>
-          <w:ilvl w:val="0"/>
-          <w:numId w:val="63"/>
-        </w:numPr>
-      </w:pPr>
-      <w:r>
-        <w:t>If Sales discussed a price, choose Propose a price and enter the proposed USD price per specimen with optional Customer-safe context. A proposal remains part of the request; it is not an issued quote or authorization to begin laboratory work.</w:t>
-      </w:r>
-    </w:p>
-    <w:p>
-      <w:pPr>
-        <w:pStyle w:val="ListNumber"/>
-        <w:numPr>
-          <w:ilvl w:val="0"/>
-          <w:numId w:val="63"/>
-        </w:numPr>
-      </w:pPr>
-      <w:r>
         <w:t>Confirm that the profile contains no patient identifiers or PHI, then choose Start pricing. The Job opens in Quote in preparation with a preserved submitted-request revision. Do not enter individual sample IDs or tube barcodes in this pricing profile.</w:t>
       </w:r>
     </w:p>
     <w:p>
       <w:pPr>
+        <w:keepNext w:val="0"/>
+        <w:spacing w:before="0" w:after="0" w:line="20" w:lineRule="exact"/>
+        <w:sectPr>
+          <w:type w:val="nextPage"/>
+          <w:footerReference w:type="default" r:id="rId9"/>
+          <w:pgSz w:w="15840" w:h="12240" w:orient="landscape"/>
+          <w:pgMar w:top="1037" w:right="1181" w:bottom="1037" w:left="1181" w:header="403" w:footer="432" w:gutter="0"/>
+          <w:cols w:space="720"/>
+          <w:docGrid w:linePitch="360"/>
+        </w:sectPr>
+      </w:pPr>
+    </w:p>
+    <w:p>
+      <w:pPr>
+        <w:keepNext/>
+        <w:pageBreakBefore w:val="0"/>
+        <w:spacing w:before="160" w:after="0" w:line="240" w:lineRule="auto"/>
+        <w:jc w:val="center"/>
+      </w:pPr>
+      <w:r>
+        <w:drawing>
+          <wp:inline xmlns:a="http://schemas.openxmlformats.org/drawingml/2006/main" xmlns:pic="http://schemas.openxmlformats.org/drawingml/2006/picture">
+            <wp:extent cx="5806440" cy="6173083"/>
+            <wp:docPr id="8" name="Picture 8" descr="Upper portion of an unsaved New Customer order form, showing Customer selection, an example Job name, biological source, sample count, proposed price option and required storage field." title="New Customer order captures the pricing scope before exact sample identifiers. This illustrative draft has not been saved; additional required fields continue below the visible form."/>
+            <wp:cNvGraphicFramePr>
+              <a:graphicFrameLocks noChangeAspect="1"/>
+            </wp:cNvGraphicFramePr>
+            <a:graphic>
+              <a:graphicData uri="http://schemas.openxmlformats.org/drawingml/2006/picture">
+                <pic:pic>
+                  <pic:nvPicPr>
+                    <pic:cNvPr id="0" name="02-new-customer-order.png"/>
+                    <pic:cNvPicPr/>
+                  </pic:nvPicPr>
+                  <pic:blipFill>
+                    <a:blip r:embed="rId17"/>
+                    <a:stretch>
+                      <a:fillRect/>
+                    </a:stretch>
+                  </pic:blipFill>
+                  <pic:spPr>
+                    <a:xfrm>
+                      <a:off x="0" y="0"/>
+                      <a:ext cx="5806440" cy="6173083"/>
+                    </a:xfrm>
+                    <a:prstGeom prst="rect"/>
+                  </pic:spPr>
+                </pic:pic>
+              </a:graphicData>
+            </a:graphic>
+          </wp:inline>
+        </w:drawing>
+      </w:r>
+    </w:p>
+    <w:p>
+      <w:pPr>
+        <w:pStyle w:val="Caption"/>
+        <w:keepNext w:val="0"/>
+        <w:keepLines/>
+      </w:pPr>
+      <w:r>
+        <w:t>Figure 3. New Customer order captures the pricing scope before exact sample identifiers. This illustrative draft has not been saved; additional required fields continue below the visible form.</w:t>
+      </w:r>
+    </w:p>
+    <w:p>
+      <w:pPr>
         <w:pStyle w:val="Heading2"/>
+        <w:pageBreakBefore/>
       </w:pPr>
       <w:r>
         <w:t>Understand the three readiness questions</w:t>
@@ -1944,10 +2082,77 @@
     </w:p>
     <w:p>
       <w:pPr>
+        <w:keepNext w:val="0"/>
+        <w:spacing w:before="0" w:after="0" w:line="20" w:lineRule="exact"/>
+        <w:sectPr>
+          <w:type w:val="nextPage"/>
+          <w:footerReference w:type="default" r:id="rId9"/>
+          <w:pgSz w:w="12240" w:h="15840" w:orient="portrait"/>
+          <w:pgMar w:top="1037" w:right="1181" w:bottom="1037" w:left="1181" w:header="403" w:footer="432" w:gutter="0"/>
+          <w:cols w:space="720"/>
+          <w:docGrid w:linePitch="360"/>
+        </w:sectPr>
+      </w:pPr>
+    </w:p>
+    <w:p>
+      <w:pPr>
         <w:pStyle w:val="Heading2"/>
+        <w:pageBreakBefore w:val="0"/>
       </w:pPr>
       <w:r>
         <w:t>Record the arriving material</w:t>
+      </w:r>
+    </w:p>
+    <w:p>
+      <w:pPr>
+        <w:keepNext/>
+        <w:spacing w:before="160" w:after="0" w:line="240" w:lineRule="auto"/>
+        <w:jc w:val="center"/>
+      </w:pPr>
+      <w:r>
+        <w:drawing>
+          <wp:inline xmlns:a="http://schemas.openxmlformats.org/drawingml/2006/main" xmlns:pic="http://schemas.openxmlformats.org/drawingml/2006/picture">
+            <wp:extent cx="8741664" cy="1154848"/>
+            <wp:docPr id="7" name="Picture 7" descr="Scan shipment packet card with a shipment packet barcode field and Look up packet button, followed by an explanation that lookup does not record custody, receipt or accession." title="Scan shipment packet finds the expected shipment. Looking up a packet does not itself record custody, receipt or accession."/>
+            <wp:cNvGraphicFramePr>
+              <a:graphicFrameLocks noChangeAspect="1"/>
+            </wp:cNvGraphicFramePr>
+            <a:graphic>
+              <a:graphicData uri="http://schemas.openxmlformats.org/drawingml/2006/picture">
+                <pic:pic>
+                  <pic:nvPicPr>
+                    <pic:cNvPr id="0" name="08-lab-receipt-full.png"/>
+                    <pic:cNvPicPr/>
+                  </pic:nvPicPr>
+                  <pic:blipFill>
+                    <a:blip r:embed="rId16"/>
+                    <a:srcRect l="19504" t="58732" r="20242" b="24472"/>
+                    <a:stretch>
+                      <a:fillRect/>
+                    </a:stretch>
+                  </pic:blipFill>
+                  <pic:spPr>
+                    <a:xfrm>
+                      <a:off x="0" y="0"/>
+                      <a:ext cx="8741664" cy="1154848"/>
+                    </a:xfrm>
+                    <a:prstGeom prst="rect"/>
+                  </pic:spPr>
+                </pic:pic>
+              </a:graphicData>
+            </a:graphic>
+          </wp:inline>
+        </w:drawing>
+      </w:r>
+    </w:p>
+    <w:p>
+      <w:pPr>
+        <w:pStyle w:val="Caption"/>
+        <w:keepNext w:val="0"/>
+        <w:keepLines/>
+      </w:pPr>
+      <w:r>
+        <w:t>Figure 4. Scan shipment packet finds the expected shipment. Looking up a packet does not itself record custody, receipt or accession.</w:t>
       </w:r>
     </w:p>
     <w:p>
@@ -2006,8 +2211,22 @@
     </w:p>
     <w:p>
       <w:pPr>
+        <w:keepNext w:val="0"/>
+        <w:spacing w:before="0" w:after="0" w:line="20" w:lineRule="exact"/>
+        <w:sectPr>
+          <w:type w:val="nextPage"/>
+          <w:footerReference w:type="default" r:id="rId9"/>
+          <w:pgSz w:w="15840" w:h="12240" w:orient="landscape"/>
+          <w:pgMar w:top="1037" w:right="1181" w:bottom="1037" w:left="1181" w:header="403" w:footer="432" w:gutter="0"/>
+          <w:cols w:space="720"/>
+          <w:docGrid w:linePitch="360"/>
+        </w:sectPr>
+      </w:pPr>
+    </w:p>
+    <w:p>
+      <w:pPr>
         <w:pStyle w:val="Heading1"/>
-        <w:pageBreakBefore/>
+        <w:pageBreakBefore w:val="0"/>
       </w:pPr>
       <w:r>
         <w:t>Configure and approve Trial scope</w:t>
@@ -2040,6 +2259,57 @@
     </w:p>
     <w:p>
       <w:pPr>
+        <w:keepNext/>
+        <w:spacing w:before="160" w:after="0" w:line="240" w:lineRule="auto"/>
+        <w:jc w:val="center"/>
+      </w:pPr>
+      <w:r>
+        <w:drawing>
+          <wp:inline xmlns:a="http://schemas.openxmlformats.org/drawingml/2006/main" xmlns:pic="http://schemas.openxmlformats.org/drawingml/2006/picture">
+            <wp:extent cx="5806440" cy="4218207"/>
+            <wp:docPr id="6" name="Picture 6" descr="Assign primary approver dialog with an example Phaeno user, required approval responsibility still unselected, optional note, and Cancel and Save actions." title="Choose a primary approver and their approval responsibility. The note is optional; the illustrated assignment has not been saved."/>
+            <wp:cNvGraphicFramePr>
+              <a:graphicFrameLocks noChangeAspect="1"/>
+            </wp:cNvGraphicFramePr>
+            <a:graphic>
+              <a:graphicData uri="http://schemas.openxmlformats.org/drawingml/2006/picture">
+                <pic:pic>
+                  <pic:nvPicPr>
+                    <pic:cNvPr id="0" name="04-trial-primary-approver.png"/>
+                    <pic:cNvPicPr/>
+                  </pic:nvPicPr>
+                  <pic:blipFill>
+                    <a:blip r:embed="rId15"/>
+                    <a:stretch>
+                      <a:fillRect/>
+                    </a:stretch>
+                  </pic:blipFill>
+                  <pic:spPr>
+                    <a:xfrm>
+                      <a:off x="0" y="0"/>
+                      <a:ext cx="5806440" cy="4218207"/>
+                    </a:xfrm>
+                    <a:prstGeom prst="rect"/>
+                  </pic:spPr>
+                </pic:pic>
+              </a:graphicData>
+            </a:graphic>
+          </wp:inline>
+        </w:drawing>
+      </w:r>
+    </w:p>
+    <w:p>
+      <w:pPr>
+        <w:pStyle w:val="Caption"/>
+        <w:keepNext w:val="0"/>
+        <w:keepLines/>
+      </w:pPr>
+      <w:r>
+        <w:t>Figure 5. Choose a primary approver and their approval responsibility. The note is optional; the illustrated assignment has not been saved.</w:t>
+      </w:r>
+    </w:p>
+    <w:p>
+      <w:pPr>
         <w:pStyle w:val="ListNumber"/>
         <w:numPr>
           <w:ilvl w:val="0"/>
@@ -2060,6 +2330,57 @@
       </w:pPr>
       <w:r>
         <w:t>Scientific Operations authorities maintain the versioned Deliverable catalog. Define a new revision or retire an item for future selection. FASTQ, FASTA and BAM are initial configurable defaults; an approved scope retains its selected definitions and versions.</w:t>
+      </w:r>
+    </w:p>
+    <w:p>
+      <w:pPr>
+        <w:keepNext/>
+        <w:spacing w:before="160" w:after="0" w:line="240" w:lineRule="auto"/>
+        <w:jc w:val="center"/>
+      </w:pPr>
+      <w:r>
+        <w:drawing>
+          <wp:inline xmlns:a="http://schemas.openxmlformats.org/drawingml/2006/main" xmlns:pic="http://schemas.openxmlformats.org/drawingml/2006/picture">
+            <wp:extent cx="6263640" cy="1475293"/>
+            <wp:docPr id="5" name="Picture 5" descr="Read-only Deliverable catalog listing BAM alignments, FASTA sequences and FASTQ sequencing reads, each at revision 1 and marked Default." title="The catalog lists deliverable names, formats and revisions. Default marks an initial default selection; this view displays the catalog without edit controls."/>
+            <wp:cNvGraphicFramePr>
+              <a:graphicFrameLocks noChangeAspect="1"/>
+            </wp:cNvGraphicFramePr>
+            <a:graphic>
+              <a:graphicData uri="http://schemas.openxmlformats.org/drawingml/2006/picture">
+                <pic:pic>
+                  <pic:nvPicPr>
+                    <pic:cNvPr id="0" name="10-trial-catalog.png"/>
+                    <pic:cNvPicPr/>
+                  </pic:nvPicPr>
+                  <pic:blipFill>
+                    <a:blip r:embed="rId14"/>
+                    <a:stretch>
+                      <a:fillRect/>
+                    </a:stretch>
+                  </pic:blipFill>
+                  <pic:spPr>
+                    <a:xfrm>
+                      <a:off x="0" y="0"/>
+                      <a:ext cx="6263640" cy="1475293"/>
+                    </a:xfrm>
+                    <a:prstGeom prst="rect"/>
+                  </pic:spPr>
+                </pic:pic>
+              </a:graphicData>
+            </a:graphic>
+          </wp:inline>
+        </w:drawing>
+      </w:r>
+    </w:p>
+    <w:p>
+      <w:pPr>
+        <w:pStyle w:val="Caption"/>
+        <w:keepNext w:val="0"/>
+        <w:keepLines/>
+      </w:pPr>
+      <w:r>
+        <w:t>Figure 6. The catalog lists deliverable names, formats and revisions. Default marks an initial default selection; this view displays the catalog without edit controls.</w:t>
       </w:r>
     </w:p>
     <w:p>
@@ -2503,6 +2824,61 @@
       </w:r>
     </w:p>
     <w:p>
+      <w:pPr>
+        <w:keepNext/>
+        <w:spacing w:before="160" w:after="0" w:line="240" w:lineRule="auto"/>
+        <w:jc w:val="center"/>
+      </w:pPr>
+      <w:r>
+        <w:drawing>
+          <wp:inline xmlns:a="http://schemas.openxmlformats.org/drawingml/2006/main" xmlns:pic="http://schemas.openxmlformats.org/drawingml/2006/picture">
+            <wp:extent cx="5166360" cy="5464419"/>
+            <wp:docPr id="4" name="Picture 4" descr="Edit global retention policy dialog with standard retention days, warning days, conditional grace days, required change reason, and a disabled Save changes button while unchanged." title="Global retention policy changes apply to future releases. The form requires a change reason; existing package deadlines remain frozen."/>
+            <wp:cNvGraphicFramePr>
+              <a:graphicFrameLocks noChangeAspect="1"/>
+            </wp:cNvGraphicFramePr>
+            <a:graphic>
+              <a:graphicData uri="http://schemas.openxmlformats.org/drawingml/2006/picture">
+                <pic:pic>
+                  <pic:nvPicPr>
+                    <pic:cNvPr id="0" name="09-retention-policy-final.png"/>
+                    <pic:cNvPicPr/>
+                  </pic:nvPicPr>
+                  <pic:blipFill>
+                    <a:blip r:embed="rId13"/>
+                    <a:srcRect l="36402" t="19647" r="36402" b="19647"/>
+                    <a:stretch>
+                      <a:fillRect/>
+                    </a:stretch>
+                  </pic:blipFill>
+                  <pic:spPr>
+                    <a:xfrm>
+                      <a:off x="0" y="0"/>
+                      <a:ext cx="5166360" cy="5464419"/>
+                    </a:xfrm>
+                    <a:prstGeom prst="rect"/>
+                  </pic:spPr>
+                </pic:pic>
+              </a:graphicData>
+            </a:graphic>
+          </wp:inline>
+        </w:drawing>
+      </w:r>
+    </w:p>
+    <w:p>
+      <w:pPr>
+        <w:pStyle w:val="Caption"/>
+        <w:keepNext w:val="0"/>
+        <w:keepLines/>
+      </w:pPr>
+      <w:r>
+        <w:t>Figure 7. Global retention policy changes apply to future releases. The form requires a change reason; existing package deadlines remain frozen.</w:t>
+      </w:r>
+    </w:p>
+    <w:p>
+      <w:pPr>
+        <w:keepLines/>
+      </w:pPr>
       <w:r>
         <w:t>A package receives the applicable grace window when an artifact remains undownloaded at the standard deadline. A complete server response is the relevant completion evidence. Failed or partial transfers do not establish completion, and later completion does not shorten an already applicable grace period. Internal downloads do not satisfy the organization's condition.</w:t>
       </w:r>
@@ -2888,7 +3264,74 @@
     </w:p>
     <w:p>
       <w:pPr>
+        <w:keepNext/>
+        <w:spacing w:before="160" w:after="0" w:line="240" w:lineRule="auto"/>
+        <w:jc w:val="center"/>
+      </w:pPr>
+      <w:r>
+        <w:drawing>
+          <wp:inline xmlns:a="http://schemas.openxmlformats.org/drawingml/2006/main" xmlns:pic="http://schemas.openxmlformats.org/drawingml/2006/picture">
+            <wp:extent cx="5806440" cy="5413651"/>
+            <wp:docPr id="3" name="Picture 3" descr="Blank Record receipt dialog with Customer, external reference, payer, amount in USD, received date, payment method, bank reference, optional note and required evidence upload." title="Record receipt captures one bank event and its evidence. This blank form has not recorded or allocated any money."/>
+            <wp:cNvGraphicFramePr>
+              <a:graphicFrameLocks noChangeAspect="1"/>
+            </wp:cNvGraphicFramePr>
+            <a:graphic>
+              <a:graphicData uri="http://schemas.openxmlformats.org/drawingml/2006/picture">
+                <pic:pic>
+                  <pic:nvPicPr>
+                    <pic:cNvPr id="0" name="06-record-receipt-full.png"/>
+                    <pic:cNvPicPr/>
+                  </pic:nvPicPr>
+                  <pic:blipFill>
+                    <a:blip r:embed="rId12"/>
+                    <a:srcRect l="32218" t="15011" r="32218" b="15011"/>
+                    <a:stretch>
+                      <a:fillRect/>
+                    </a:stretch>
+                  </pic:blipFill>
+                  <pic:spPr>
+                    <a:xfrm>
+                      <a:off x="0" y="0"/>
+                      <a:ext cx="5806440" cy="5413651"/>
+                    </a:xfrm>
+                    <a:prstGeom prst="rect"/>
+                  </pic:spPr>
+                </pic:pic>
+              </a:graphicData>
+            </a:graphic>
+          </wp:inline>
+        </w:drawing>
+      </w:r>
+    </w:p>
+    <w:p>
+      <w:pPr>
+        <w:pStyle w:val="Caption"/>
+        <w:keepNext w:val="0"/>
+        <w:keepLines/>
+      </w:pPr>
+      <w:r>
+        <w:t>Figure 8. Record receipt captures one bank event and its evidence. This blank form has not recorded or allocated any money.</w:t>
+      </w:r>
+    </w:p>
+    <w:p>
+      <w:pPr>
+        <w:keepNext w:val="0"/>
+        <w:spacing w:before="0" w:after="0" w:line="20" w:lineRule="exact"/>
+        <w:sectPr>
+          <w:type w:val="nextPage"/>
+          <w:footerReference w:type="default" r:id="rId9"/>
+          <w:pgSz w:w="12240" w:h="15840" w:orient="portrait"/>
+          <w:pgMar w:top="1037" w:right="1181" w:bottom="1037" w:left="1181" w:header="403" w:footer="432" w:gutter="0"/>
+          <w:cols w:space="720"/>
+          <w:docGrid w:linePitch="360"/>
+        </w:sectPr>
+      </w:pPr>
+    </w:p>
+    <w:p>
+      <w:pPr>
         <w:pStyle w:val="Heading2"/>
+        <w:pageBreakBefore w:val="0"/>
       </w:pPr>
       <w:r>
         <w:t>Import a reviewed batch</w:t>
@@ -2896,6 +3339,58 @@
     </w:p>
     <w:p>
       <w:pPr>
+        <w:keepNext/>
+        <w:spacing w:before="160" w:after="0" w:line="240" w:lineRule="auto"/>
+        <w:jc w:val="center"/>
+      </w:pPr>
+      <w:r>
+        <w:drawing>
+          <wp:inline xmlns:a="http://schemas.openxmlformats.org/drawingml/2006/main" xmlns:pic="http://schemas.openxmlformats.org/drawingml/2006/picture">
+            <wp:extent cx="8412480" cy="4054468"/>
+            <wp:docPr id="2" name="Picture 2" descr="Finance Import receipts view with Customer and source controls, CSV file selection, required CSV content and headers, and Preview import action." title="Import receipts starts with a Customer, source and CSV file or pasted content. Preview import prepares the review; it does not yet create receipts."/>
+            <wp:cNvGraphicFramePr>
+              <a:graphicFrameLocks noChangeAspect="1"/>
+            </wp:cNvGraphicFramePr>
+            <a:graphic>
+              <a:graphicData uri="http://schemas.openxmlformats.org/drawingml/2006/picture">
+                <pic:pic>
+                  <pic:nvPicPr>
+                    <pic:cNvPr id="0" name="05-receipt-import-full.png"/>
+                    <pic:cNvPicPr/>
+                  </pic:nvPicPr>
+                  <pic:blipFill>
+                    <a:blip r:embed="rId11"/>
+                    <a:srcRect l="19561" t="25386" r="19561" b="12693"/>
+                    <a:stretch>
+                      <a:fillRect/>
+                    </a:stretch>
+                  </pic:blipFill>
+                  <pic:spPr>
+                    <a:xfrm>
+                      <a:off x="0" y="0"/>
+                      <a:ext cx="8412480" cy="4054468"/>
+                    </a:xfrm>
+                    <a:prstGeom prst="rect"/>
+                  </pic:spPr>
+                </pic:pic>
+              </a:graphicData>
+            </a:graphic>
+          </wp:inline>
+        </w:drawing>
+      </w:r>
+    </w:p>
+    <w:p>
+      <w:pPr>
+        <w:pStyle w:val="Caption"/>
+        <w:keepNext w:val="0"/>
+        <w:keepLines/>
+      </w:pPr>
+      <w:r>
+        <w:t>Figure 9. Import receipts starts with a Customer, source and CSV file or pasted content. Preview import prepares the review; it does not yet create receipts.</w:t>
+      </w:r>
+    </w:p>
+    <w:p>
+      <w:pPr>
         <w:pStyle w:val="ListNumber"/>
         <w:numPr>
           <w:ilvl w:val="0"/>
@@ -2944,7 +3439,22 @@
     </w:p>
     <w:p>
       <w:pPr>
+        <w:keepNext w:val="0"/>
+        <w:spacing w:before="0" w:after="0" w:line="20" w:lineRule="exact"/>
+        <w:sectPr>
+          <w:type w:val="nextPage"/>
+          <w:footerReference w:type="default" r:id="rId9"/>
+          <w:pgSz w:w="15840" w:h="12240" w:orient="landscape"/>
+          <w:pgMar w:top="1037" w:right="1181" w:bottom="1037" w:left="1181" w:header="403" w:footer="432" w:gutter="0"/>
+          <w:cols w:space="720"/>
+          <w:docGrid w:linePitch="360"/>
+        </w:sectPr>
+      </w:pPr>
+    </w:p>
+    <w:p>
+      <w:pPr>
         <w:pStyle w:val="Heading2"/>
+        <w:pageBreakBefore w:val="0"/>
       </w:pPr>
       <w:r>
         <w:t>Allocate or reverse deliberately</w:t>
@@ -2989,6 +3499,58 @@
     </w:p>
     <w:p>
       <w:pPr>
+        <w:keepNext/>
+        <w:spacing w:before="160" w:after="0" w:line="240" w:lineRule="auto"/>
+        <w:jc w:val="center"/>
+      </w:pPr>
+      <w:r>
+        <w:drawing>
+          <wp:inline xmlns:a="http://schemas.openxmlformats.org/drawingml/2006/main" xmlns:pic="http://schemas.openxmlformats.org/drawingml/2006/picture">
+            <wp:extent cx="5806440" cy="3296008"/>
+            <wp:docPr id="1" name="Picture 1" descr="Create reconciliation dialog with period end, bank total, an empty included-receipts list explaining the prerequisite, and a disabled Create reconciliation button." title="New reconciliation requires eligible recorded receipts. This example has none, so a batch cannot yet be created."/>
+            <wp:cNvGraphicFramePr>
+              <a:graphicFrameLocks noChangeAspect="1"/>
+            </wp:cNvGraphicFramePr>
+            <a:graphic>
+              <a:graphicData uri="http://schemas.openxmlformats.org/drawingml/2006/picture">
+                <pic:pic>
+                  <pic:nvPicPr>
+                    <pic:cNvPr id="0" name="07-reconciliation-full.png"/>
+                    <pic:cNvPicPr/>
+                  </pic:nvPicPr>
+                  <pic:blipFill>
+                    <a:blip r:embed="rId10"/>
+                    <a:srcRect l="32218" t="28698" r="32218" b="28698"/>
+                    <a:stretch>
+                      <a:fillRect/>
+                    </a:stretch>
+                  </pic:blipFill>
+                  <pic:spPr>
+                    <a:xfrm>
+                      <a:off x="0" y="0"/>
+                      <a:ext cx="5806440" cy="3296008"/>
+                    </a:xfrm>
+                    <a:prstGeom prst="rect"/>
+                  </pic:spPr>
+                </pic:pic>
+              </a:graphicData>
+            </a:graphic>
+          </wp:inline>
+        </w:drawing>
+      </w:r>
+    </w:p>
+    <w:p>
+      <w:pPr>
+        <w:pStyle w:val="Caption"/>
+        <w:keepNext w:val="0"/>
+        <w:keepLines/>
+      </w:pPr>
+      <w:r>
+        <w:t>Figure 10. New reconciliation requires eligible recorded receipts. This example has none, so a batch cannot yet be created.</w:t>
+      </w:r>
+    </w:p>
+    <w:p>
+      <w:pPr>
         <w:pStyle w:val="ListNumber"/>
         <w:numPr>
           <w:ilvl w:val="0"/>
@@ -3111,8 +3673,9 @@
       </w:r>
     </w:p>
     <w:sectPr>
+      <w:type w:val="nextPage"/>
       <w:footerReference w:type="default" r:id="rId9"/>
-      <w:pgSz w:w="12240" w:h="15840"/>
+      <w:pgSz w:w="12240" w:h="15840" w:orient="portrait"/>
       <w:pgMar w:top="1037" w:right="1181" w:bottom="1037" w:left="1181" w:header="403" w:footer="432" w:gutter="0"/>
       <w:cols w:space="720"/>
       <w:docGrid w:linePitch="360"/>
@@ -4475,12 +5038,13 @@
     <w:rsid w:val="00FC693F"/>
     <w:pPr>
       <w:widowControl/>
-      <w:spacing w:line="240" w:lineRule="auto"/>
+      <w:spacing w:line="252" w:lineRule="auto" w:before="100" w:after="220"/>
     </w:pPr>
     <w:rPr>
       <w:rFonts w:ascii="Calibri" w:hAnsi="Calibri" w:eastAsia="Calibri"/>
       <w:b/>
       <w:bCs/>
+      <w:i w:val="0"/>
       <w:color w:val="000000"/>
       <w:sz w:val="18"/>
       <w:szCs w:val="18"/>

</xml_diff>

<commit_message>
Tighten Portal dialog recovery and workflow consistency
</commit_message>
<xml_diff>
--- a/docs/Phaeno-POMS-Order-to-Cash-Guide.docx
+++ b/docs/Phaeno-POMS-Order-to-Cash-Guide.docx
@@ -1141,7 +1141,7 @@
     </w:p>
     <w:p>
       <w:r>
-        <w:t>Asterisks mark required fields. Correct errors and review the current record after a conflict; failed actions retain entered values. Changed forms ask before discarding work. Avoid a second action while saving. Escape closes searchable choices first; closing a dialog returns focus to its opening action.</w:t>
+        <w:t>Asterisks mark required fields. Dialog errors keep messages and entries visible for correction. After a conflict, review the current record before retrying. Changed forms ask before discarding; avoid repeat actions while saving. Escape closes searchable choices first; closing restores focus to the opener.</w:t>
       </w:r>
     </w:p>
     <w:p>
@@ -2065,7 +2065,7 @@
         </w:numPr>
       </w:pPr>
       <w:r>
-        <w:t>Assign each physical tube barcode to its intended sample and slot. Compare the full crosswalk, confirm it, and print the frozen shipment packet. A multi-tube sample must have all required slots assigned.</w:t>
+        <w:t>Assign each physical tube barcode to its intended sample and slot. Compare the full crosswalk, confirm it, and print the frozen shipment packet. A multi-tube sample must have all required slots assigned. Confirmation distinguishes the sample count from the tube count. View packet checks the current revision before Print packet becomes available. Reconnect or choose Try again if that check fails; corrections and replacements refresh the displayed revision.</w:t>
       </w:r>
     </w:p>
     <w:p>
@@ -2176,7 +2176,7 @@
         </w:numPr>
       </w:pPr>
       <w:r>
-        <w:t>Choose Open receipt to open the linked Lab work order with the scanned shipment and tube context. A successful comparison identifies expected material; it does not itself record custody, receipt or accession.</w:t>
+        <w:t>After comparing the tube, choose Continue to receipt and accession to open the linked Lab work order with the scanned shipment and tube context. A successful comparison identifies expected material; it does not itself record custody, receipt or accession. A failed identity check offers Try again; it does not establish a tube mismatch. Returning from Lab work or protocol execution keeps the originating section and shipment, even after work status changes.</w:t>
       </w:r>
     </w:p>
     <w:p>
@@ -2521,7 +2521,7 @@
     </w:p>
     <w:p>
       <w:r>
-        <w:t>Holds stop affected scientific work and shipping changes; necessary custody and exception facts remain recordable. Failed saves preserve entries. Reload current Trial; keep my entries refreshes the applicable scope and choices for deliberate review without discarding the draft.</w:t>
+        <w:t>Holds stop affected scientific work and shipping changes; necessary custody and exception facts remain recordable. Failed saves preserve entries. Reload current Trial; keep my entries refreshes the applicable scope and choices for deliberate review without discarding the draft. Changed Trial dialogs ask before discarding entries through Cancel, Escape or navigation. Editing, repeat Save and dismissal are blocked while saving or explicitly reloading. A failed background configuration check preserves the draft; use Retry configuration.</w:t>
       </w:r>
     </w:p>
     <w:p>
@@ -2820,7 +2820,7 @@
     </w:p>
     <w:p>
       <w:r>
-        <w:t>The global policy starts with 30 standard days, a warning 5 days before that deadline, and a conditional 5-day grace period. A Company override may change the effective policy for future releases. Use the dates shown on the specific release; each policy day is an exact 24-hour interval.</w:t>
+        <w:t>The global policy starts with 30 standard days, a warning 5 days before that deadline, and a conditional 5-day grace period. A Company override may change the effective policy for future releases. Use the dates shown on the specific release; each policy day is an exact 24-hour interval. Global-policy and Company-override editors keep the revision you reviewed when opening them. Background updates do not replace that review or its entered values. Changed forms ask before discarding; saving prevents editing, repeat submission and dismissal. If a policy changes elsewhere, review its current revision before retrying. Existing package deadlines remain frozen.</w:t>
       </w:r>
     </w:p>
     <w:p>
@@ -3467,7 +3467,7 @@
     </w:p>
     <w:p>
       <w:r>
-        <w:t>Reverse receipt is available when no allocation remains and requires a reason. Reversals preserve the original fact and actor. If another user changes the receipt or invoice during a save, review the current record before retrying; unsuccessful actions retain the form values.</w:t>
+        <w:t>Reverse receipt is available when no allocation remains and requires a reason. Reversals preserve the original fact and actor. If another user changes the receipt or invoice during a save, review the current record before retrying; unsuccessful actions retain the form values. For adjustments, allocations and reversals, POMS refreshes a conflicting record and keeps your entries. Check the displayed current status and balances, choose Use reviewed record, then review the entries and save again. If refreshing fails, choose Retry current record. POMS does not repeat the financial action automatically.</w:t>
       </w:r>
     </w:p>
     <w:p>

</xml_diff>

<commit_message>
Add persistent file storage and complete Portal workflow corrections
</commit_message>
<xml_diff>
--- a/docs/Phaeno-POMS-Order-to-Cash-Guide.docx
+++ b/docs/Phaeno-POMS-Order-to-Cash-Guide.docx
@@ -820,7 +820,7 @@
                 <w:rFonts w:ascii="Calibri" w:hAnsi="Calibri"/>
                 <w:sz w:val="18"/>
               </w:rPr>
-              <w:t>12–14</w:t>
+              <w:t>12–15</w:t>
             </w:r>
           </w:p>
         </w:tc>
@@ -881,7 +881,7 @@
                 <w:rFonts w:ascii="Calibri" w:hAnsi="Calibri"/>
                 <w:sz w:val="18"/>
               </w:rPr>
-              <w:t>15</w:t>
+              <w:t>16</w:t>
             </w:r>
           </w:p>
         </w:tc>
@@ -942,7 +942,7 @@
                 <w:rFonts w:ascii="Calibri" w:hAnsi="Calibri"/>
                 <w:sz w:val="18"/>
               </w:rPr>
-              <w:t>16–18</w:t>
+              <w:t>17–19</w:t>
             </w:r>
           </w:p>
         </w:tc>
@@ -1003,7 +1003,7 @@
                 <w:rFonts w:ascii="Calibri" w:hAnsi="Calibri"/>
                 <w:sz w:val="18"/>
               </w:rPr>
-              <w:t>19</w:t>
+              <w:t>20</w:t>
             </w:r>
           </w:p>
         </w:tc>
@@ -1064,7 +1064,7 @@
                 <w:rFonts w:ascii="Calibri" w:hAnsi="Calibri"/>
                 <w:sz w:val="18"/>
               </w:rPr>
-              <w:t>20–25</w:t>
+              <w:t>21–26</w:t>
             </w:r>
           </w:p>
         </w:tc>
@@ -1322,7 +1322,7 @@
     </w:p>
     <w:p>
       <w:r>
-        <w:t>CRM Companies owns the canonical Company record. Use its existing operational organization, people and departments throughout the Portal; a data grant or sales handoff should not create a second organization.</w:t>
+        <w:t>CRM Companies owns the canonical Company record. Use its existing operational organization, people and departments throughout the Portal; a data grant or sales handoff should not create a second organization. Phaeno staff with the Commercial role can maintain ordinary CRM relationships, sales and follow-up records, and read Reports. Platform administrators additionally control Portal access, Company Requests, CRM administration and restricted records.</w:t>
       </w:r>
     </w:p>
     <w:p>
@@ -1354,7 +1354,7 @@
         </w:numPr>
       </w:pPr>
       <w:r>
-        <w:t>Use Invite to Portal when the person needs access. Choose Member or Organization administrator and the permitted Department administrator assignments deliberately. Appoint the first active organization administrator before quote issuance or Trial acceptance.</w:t>
+        <w:t>A platform administrator uses Invite to Portal when the person needs access. Choose Member or Organization administrator and the permitted Department administrator assignments deliberately. Appoint the first active organization administrator before quote issuance or Trial acceptance.</w:t>
       </w:r>
     </w:p>
     <w:p>
@@ -1366,7 +1366,7 @@
         </w:numPr>
       </w:pPr>
       <w:r>
-        <w:t>Use Manage access to maintain organization and Department roles, deactivate membership, or handle a pending invitation. Resend and revoke are explicit actions. Deactivation preserves the person and prior activity.</w:t>
+        <w:t>A platform administrator uses Manage access to maintain organization and Department roles, deactivate membership, or handle a pending invitation. Resend and revoke are explicit actions. Deactivation preserves the person and prior activity.</w:t>
       </w:r>
     </w:p>
     <w:p>
@@ -1391,7 +1391,7 @@
     </w:p>
     <w:p>
       <w:r>
-        <w:t>The Company Requests tab preserves its request history. The central Requests workspace separates Needs decision, Approved / needs work, and Completed / history. Approval records the decision; it does not always finish the required operational work.</w:t>
+        <w:t>For platform administrators, the Company Requests tab preserves its request history. The central Requests workspace separates Needs decision, Approved / needs work, and Completed / history. Approval records the decision; it does not always finish the required operational work.</w:t>
       </w:r>
     </w:p>
     <w:p>
@@ -2433,6 +2433,63 @@
       </w:r>
     </w:p>
     <w:p>
+      <w:r>
+        <w:t>Save draft keeps an unfinished scope for authorized Phaeno Trial staff. Required approval fields may remain incomplete, but entered values must be valid. The Trial shows Shared scope draft with the last saver and time; Resume draft continues the work. The Prospect cannot see this draft. Saving leaves the current scope, approvals and acceptance unchanged and does not authorize samples or Lab work.</w:t>
+      </w:r>
+    </w:p>
+    <w:p>
+      <w:pPr>
+        <w:keepNext/>
+        <w:spacing w:before="160" w:after="0" w:line="240" w:lineRule="auto"/>
+        <w:jc w:val="center"/>
+      </w:pPr>
+      <w:r>
+        <w:drawing>
+          <wp:inline xmlns:a="http://schemas.openxmlformats.org/drawingml/2006/main" xmlns:pic="http://schemas.openxmlformats.org/drawingml/2006/picture">
+            <wp:extent cx="5806440" cy="4625130"/>
+            <wp:docPr id="11" name="Picture 11" descr="Lower portion of a synthetic incomplete Trial scope showing material and terms, internal commercial context, the required-for-approval legend, Save draft and Submit scope for approval." title="Save draft keeps an incomplete staff scope without changing approvals."/>
+            <wp:cNvGraphicFramePr>
+              <a:graphicFrameLocks noChangeAspect="1"/>
+            </wp:cNvGraphicFramePr>
+            <a:graphic>
+              <a:graphicData uri="http://schemas.openxmlformats.org/drawingml/2006/picture">
+                <pic:pic>
+                  <pic:nvPicPr>
+                    <pic:cNvPr id="0" name="trial-draft-controls.png"/>
+                    <pic:cNvPicPr/>
+                  </pic:nvPicPr>
+                  <pic:blipFill>
+                    <a:blip r:embed="rId20"/>
+                    <a:srcRect l="26271" r="36566" t="18515" b="19499"/>
+                    <a:stretch>
+                      <a:fillRect/>
+                    </a:stretch>
+                  </pic:blipFill>
+                  <pic:spPr>
+                    <a:xfrm>
+                      <a:off x="0" y="0"/>
+                      <a:ext cx="5806440" cy="4625130"/>
+                    </a:xfrm>
+                    <a:prstGeom prst="rect"/>
+                  </pic:spPr>
+                </pic:pic>
+              </a:graphicData>
+            </a:graphic>
+          </wp:inline>
+        </w:drawing>
+      </w:r>
+    </w:p>
+    <w:p>
+      <w:pPr>
+        <w:pStyle w:val="Caption"/>
+        <w:keepNext w:val="0"/>
+        <w:keepLines/>
+      </w:pPr>
+      <w:r>
+        <w:t>Figure 7. This synthetic local example shows an incomplete Trial scope. Save draft retains staff work and leaves approvals unchanged; Submit scope for approval requires the completed scope.</w:t>
+      </w:r>
+    </w:p>
+    <w:p>
       <w:pPr>
         <w:pStyle w:val="ListNumber"/>
         <w:numPr>
@@ -2441,7 +2498,7 @@
         </w:numPr>
       </w:pPr>
       <w:r>
-        <w:t>Obtain affirmative Commercial and Scientific Operations decisions from two different people for the exact scope revision. A person authorized for both responsibilities cannot approve both sides of the same revision.</w:t>
+        <w:t>When the scope is complete, choose Submit scope for approval. Obtain affirmative Commercial and Scientific Operations decisions from two different people for the exact scope revision. A person authorized for both responsibilities cannot approve both sides of the same revision.</w:t>
       </w:r>
     </w:p>
     <w:p>
@@ -2576,7 +2633,7 @@
     </w:p>
     <w:p>
       <w:r>
-        <w:t>Manage active Phaeno laboratory roles in User management. Operators record physical work; Supervisors handle the permitted QC and exception decisions; Protocol Administrators control definitions; Scientific Reviewers approve the release scope. Assign only the roles needed for the person’s work.</w:t>
+        <w:t>Manage active Phaeno laboratory roles in User management. Operators record physical work; Supervisors handle the permitted QC and exception decisions; Protocol Administrators control definitions; Scientific Reviewers approve the release scope. Assign only the roles needed for the person's work.</w:t>
       </w:r>
     </w:p>
     <w:p>
@@ -2872,7 +2929,7 @@
         <w:keepLines/>
       </w:pPr>
       <w:r>
-        <w:t>Figure 7. Global retention policy changes apply to future releases. The form requires a change reason; existing package deadlines remain frozen.</w:t>
+        <w:t>Figure 8. Global retention policy changes apply to future releases. The form requires a change reason; existing package deadlines remain frozen.</w:t>
       </w:r>
     </w:p>
     <w:p>
@@ -3311,7 +3368,7 @@
         <w:keepLines/>
       </w:pPr>
       <w:r>
-        <w:t>Figure 8. Record receipt captures one bank event and its evidence. This blank form has not recorded or allocated any money.</w:t>
+        <w:t>Figure 9. Record receipt captures one bank event and its evidence. This blank form has not recorded or allocated any money.</w:t>
       </w:r>
     </w:p>
     <w:p>
@@ -3386,7 +3443,7 @@
         <w:keepLines/>
       </w:pPr>
       <w:r>
-        <w:t>Figure 9. Import receipts starts with a Customer, source and CSV file or pasted content. Preview import prepares the review; it does not yet create receipts.</w:t>
+        <w:t>Figure 10. Import receipts starts with a Customer, source and CSV file or pasted content. Preview import prepares the review; it does not yet create receipts.</w:t>
       </w:r>
     </w:p>
     <w:p>
@@ -3462,12 +3519,17 @@
     </w:p>
     <w:p>
       <w:r>
-        <w:t>From the receipt record, choose Allocate to invoice, select a same-Customer invoice and enter an amount within the available receipt and invoice balance. A partial allocation, one receipt across several invoices, or several receipts against one invoice can be recorded as separate allocations. Overpayments remain unapplied until deliberately resolved.</w:t>
+        <w:t>From the receipt record, choose Allocate to invoice, select a same-Customer invoice and enter an amount within the available receipt and invoice balance. A partial allocation, one receipt across several invoices, or several receipts against one invoice can be recorded as separate allocations. Overpayments remain unapplied until deliberately resolved. Search invoices matches invoice numbers; Previous invoices and Next invoices browse 25 at a time. Your selected invoice is retained when you search or change pages.</w:t>
       </w:r>
     </w:p>
     <w:p>
       <w:r>
-        <w:t>Reverse receipt is available when no allocation remains and requires a reason. Reversals preserve the original fact and actor. If another user changes the receipt or invoice during a save, review the current record before retrying; unsuccessful actions retain the form values. For adjustments, allocations and reversals, POMS refreshes a conflicting record and keeps your entries. Check the displayed current status and balances, choose Use reviewed record, then review the entries and save again. If refreshing fails, choose Retry current record. POMS does not repeat the financial action automatically.</w:t>
+        <w:t>Allocation history shows each invoice, amount, Applied or Reversed status, and who recorded or reversed it and when. Reverse allocation requires a reason, restores unapplied cash and the invoice balance, and retains the original allocation and reversal history.</w:t>
+      </w:r>
+    </w:p>
+    <w:p>
+      <w:r>
+        <w:t>Reverse receipt is available when no allocation remains and requires a reason. Reversals preserve the original fact and actor. If another user changes the receipt or invoice during a save, review the current record before retrying; unsuccessful actions retain the form values. For adjustments, allocations, reversals and reconciliation draft corrections, POMS refreshes a conflicting record and keeps your entries. Check the displayed current status and balances, choose Use reviewed record, then review the entries and save again. If refreshing fails, choose Retry current record. POMS does not repeat the financial action automatically.</w:t>
       </w:r>
     </w:p>
     <w:p>
@@ -3546,7 +3608,7 @@
         <w:keepLines/>
       </w:pPr>
       <w:r>
-        <w:t>Figure 10. New reconciliation requires eligible recorded receipts. This example has none, so a batch cannot yet be created.</w:t>
+        <w:t>Figure 11. New reconciliation requires eligible recorded receipts. This example has none, so a batch cannot yet be created.</w:t>
       </w:r>
     </w:p>
     <w:p>
@@ -3570,7 +3632,17 @@
         </w:numPr>
       </w:pPr>
       <w:r>
-        <w:t>Open the batch number. Compare the ledger total, bank total and difference with the underlying evidence. Resolve differences in the owning receipts, allocations or adjustments rather than rewriting the batch history.</w:t>
+        <w:t>Open the batch number. Compare the ledger total, bank total and difference with Included sources and the underlying evidence. Resolve source errors in the owning receipts, allocations or adjustments.</w:t>
+      </w:r>
+    </w:p>
+    <w:p>
+      <w:r>
+        <w:t>While the batch is Draft, Edit draft lets a Cash Operator correct the period end, bank total and included receipts using Save draft changes with a reason. Existing allocation and adjustment links remain. Draft change history retains who made each change, when, why, and the previous and revised period and totals.</w:t>
+      </w:r>
+    </w:p>
+    <w:p>
+      <w:r>
+        <w:t>Cancel draft requires a reason and stops further reconciliation actions while preserving the batch, its history and source financial records. Submitted and approved batches cannot be edited. Failed correction entries remain available; after a version conflict, review the refreshed record and choose Use reviewed record before retrying.</w:t>
       </w:r>
     </w:p>
     <w:p>
@@ -3582,7 +3654,7 @@
         </w:numPr>
       </w:pPr>
       <w:r>
-        <w:t>Submit balanced batch when the difference is zero. A Cash Reconciler who contributed none of the batch activity reviews it and chooses Approve independently. Approval preserves the immutable closeout report.</w:t>
+        <w:t>Submit balanced batch when the difference is zero. A Cash Reconciler who contributed none of the batch activity, including any previous draft edit, reviews it and chooses Approve independently. Approval preserves the immutable closeout report.</w:t>
       </w:r>
     </w:p>
     <w:p>

</xml_diff>

<commit_message>
Implement configured Lab and Partner Kit bundles with coordinated backups
</commit_message>
<xml_diff>
--- a/docs/Phaeno-POMS-Order-to-Cash-Guide.docx
+++ b/docs/Phaeno-POMS-Order-to-Cash-Guide.docx
@@ -38,7 +38,7 @@
     </w:p>
     <w:p>
       <w:r>
-        <w:t>Order configuration defines the offerings, scientific requirements, sample shipping and defaults available for new work. Company setup defines a particular organization's people, departments, service access and readiness. Order intake is used for each paid Job: it captures the request, resolves its current blockers, and manages pricing and the quote.</w:t>
+        <w:t>Order configuration maintains offerings, scientific requirements, sample shipping and defaults. Company setup maintains an organization's people, Departments, service access and readiness. These are shared setup. A new standard Lab Job or Kit order is prepared and priced for each purchase. Order intake is the staff workspace for commercial review, manual pricing and approved sales-assisted work.</w:t>
       </w:r>
     </w:p>
     <w:tbl>
@@ -169,11 +169,9 @@
             </w:pPr>
             <w:r>
               <w:rPr>
-                <w:b w:val="0"/>
-                <w:color w:val="000000"/>
                 <w:sz w:val="20"/>
               </w:rPr>
-              <w:t>A Customer accepts a versioned quote, then finalizes the exact sample roster.</w:t>
+              <w:t>A configured price or accepted manual quote defines the commitment, followed by the exact sample roster.</w:t>
             </w:r>
           </w:p>
         </w:tc>
@@ -189,11 +187,9 @@
             </w:pPr>
             <w:r>
               <w:rPr>
-                <w:b w:val="0"/>
-                <w:color w:val="000000"/>
                 <w:sz w:val="20"/>
               </w:rPr>
-              <w:t>Scientific release is independent of payment. Native POMS Finance manages the invoice and cash.</w:t>
+              <w:t>Scientific release is independent of payment. Native POMS Finance currently covers Customer Lab invoices.</w:t>
             </w:r>
           </w:p>
         </w:tc>
@@ -299,11 +295,9 @@
             </w:pPr>
             <w:r>
               <w:rPr>
-                <w:b w:val="0"/>
-                <w:color w:val="000000"/>
                 <w:sz w:val="20"/>
               </w:rPr>
-              <w:t>A placed kit order or an accepted Assembly quote defines the commitment.</w:t>
+              <w:t>Each purchased Kit unit includes one Assembly case. Historical standalone quotes retain their prior terms.</w:t>
             </w:r>
           </w:p>
         </w:tc>
@@ -510,12 +504,14 @@
             <w:shd w:fill="FFFFFF"/>
           </w:tcPr>
           <w:p>
+            <w:pPr>
+              <w:spacing w:after="60" w:line="240" w:lineRule="auto"/>
+            </w:pPr>
             <w:r>
               <w:rPr>
-                <w:rFonts w:ascii="Calibri" w:hAnsi="Calibri"/>
-                <w:sz w:val="18"/>
+                <w:sz w:val="20"/>
               </w:rPr>
-              <w:t>3–4</w:t>
+              <w:t>3–5</w:t>
             </w:r>
           </w:p>
         </w:tc>
@@ -571,12 +567,14 @@
             <w:shd w:fill="F3F6F8"/>
           </w:tcPr>
           <w:p>
+            <w:pPr>
+              <w:spacing w:after="60" w:line="240" w:lineRule="auto"/>
+            </w:pPr>
             <w:r>
               <w:rPr>
-                <w:rFonts w:ascii="Calibri" w:hAnsi="Calibri"/>
-                <w:sz w:val="18"/>
+                <w:sz w:val="20"/>
               </w:rPr>
-              <w:t>5</w:t>
+              <w:t>6</w:t>
             </w:r>
           </w:p>
         </w:tc>
@@ -597,11 +595,9 @@
             </w:pPr>
             <w:r>
               <w:rPr>
-                <w:b w:val="0"/>
-                <w:color w:val="000000"/>
                 <w:sz w:val="20"/>
               </w:rPr>
-              <w:t>Start and price a paid Job</w:t>
+              <w:t>Review a standard price or start assisted work</w:t>
             </w:r>
           </w:p>
         </w:tc>
@@ -617,11 +613,9 @@
             </w:pPr>
             <w:r>
               <w:rPr>
-                <w:b w:val="0"/>
-                <w:color w:val="000000"/>
                 <w:sz w:val="20"/>
               </w:rPr>
-              <w:t>Order Ops &gt; Order intake</w:t>
+              <w:t>Lab Job or Order Ops &gt; Order intake</w:t>
             </w:r>
           </w:p>
         </w:tc>
@@ -632,12 +626,14 @@
             <w:shd w:fill="FFFFFF"/>
           </w:tcPr>
           <w:p>
+            <w:pPr>
+              <w:spacing w:after="60" w:line="240" w:lineRule="auto"/>
+            </w:pPr>
             <w:r>
               <w:rPr>
-                <w:rFonts w:ascii="Calibri" w:hAnsi="Calibri"/>
-                <w:sz w:val="18"/>
+                <w:sz w:val="20"/>
               </w:rPr>
-              <w:t>6–8</w:t>
+              <w:t>7–11</w:t>
             </w:r>
           </w:p>
         </w:tc>
@@ -658,11 +654,9 @@
             </w:pPr>
             <w:r>
               <w:rPr>
-                <w:b w:val="0"/>
-                <w:color w:val="000000"/>
                 <w:sz w:val="20"/>
               </w:rPr>
-              <w:t>Accept a quote and prepare exact samples</w:t>
+              <w:t>Review a manual quote and prepare exact samples</w:t>
             </w:r>
           </w:p>
         </w:tc>
@@ -693,12 +687,14 @@
             <w:shd w:fill="F3F6F8"/>
           </w:tcPr>
           <w:p>
+            <w:pPr>
+              <w:spacing w:after="60" w:line="240" w:lineRule="auto"/>
+            </w:pPr>
             <w:r>
               <w:rPr>
-                <w:rFonts w:ascii="Calibri" w:hAnsi="Calibri"/>
-                <w:sz w:val="18"/>
+                <w:sz w:val="20"/>
               </w:rPr>
-              <w:t>9</w:t>
+              <w:t>12</w:t>
             </w:r>
           </w:p>
         </w:tc>
@@ -754,12 +750,14 @@
             <w:shd w:fill="FFFFFF"/>
           </w:tcPr>
           <w:p>
+            <w:pPr>
+              <w:spacing w:after="60" w:line="240" w:lineRule="auto"/>
+            </w:pPr>
             <w:r>
               <w:rPr>
-                <w:rFonts w:ascii="Calibri" w:hAnsi="Calibri"/>
-                <w:sz w:val="18"/>
+                <w:sz w:val="20"/>
               </w:rPr>
-              <w:t>10–11</w:t>
+              <w:t>13–15</w:t>
             </w:r>
           </w:p>
         </w:tc>
@@ -815,12 +813,14 @@
             <w:shd w:fill="F3F6F8"/>
           </w:tcPr>
           <w:p>
+            <w:pPr>
+              <w:spacing w:after="60" w:line="240" w:lineRule="auto"/>
+            </w:pPr>
             <w:r>
               <w:rPr>
-                <w:rFonts w:ascii="Calibri" w:hAnsi="Calibri"/>
-                <w:sz w:val="18"/>
+                <w:sz w:val="20"/>
               </w:rPr>
-              <w:t>12–15</w:t>
+              <w:t>16–19</w:t>
             </w:r>
           </w:p>
         </w:tc>
@@ -876,12 +876,14 @@
             <w:shd w:fill="FFFFFF"/>
           </w:tcPr>
           <w:p>
+            <w:pPr>
+              <w:spacing w:after="60" w:line="240" w:lineRule="auto"/>
+            </w:pPr>
             <w:r>
               <w:rPr>
-                <w:rFonts w:ascii="Calibri" w:hAnsi="Calibri"/>
-                <w:sz w:val="18"/>
+                <w:sz w:val="20"/>
               </w:rPr>
-              <w:t>16</w:t>
+              <w:t>20</w:t>
             </w:r>
           </w:p>
         </w:tc>
@@ -937,12 +939,14 @@
             <w:shd w:fill="F3F6F8"/>
           </w:tcPr>
           <w:p>
+            <w:pPr>
+              <w:spacing w:after="60" w:line="240" w:lineRule="auto"/>
+            </w:pPr>
             <w:r>
               <w:rPr>
-                <w:rFonts w:ascii="Calibri" w:hAnsi="Calibri"/>
-                <w:sz w:val="18"/>
+                <w:sz w:val="20"/>
               </w:rPr>
-              <w:t>17–19</w:t>
+              <w:t>21–23</w:t>
             </w:r>
           </w:p>
         </w:tc>
@@ -998,12 +1002,14 @@
             <w:shd w:fill="FFFFFF"/>
           </w:tcPr>
           <w:p>
+            <w:pPr>
+              <w:spacing w:after="60" w:line="240" w:lineRule="auto"/>
+            </w:pPr>
             <w:r>
               <w:rPr>
-                <w:rFonts w:ascii="Calibri" w:hAnsi="Calibri"/>
-                <w:sz w:val="18"/>
+                <w:sz w:val="20"/>
               </w:rPr>
-              <w:t>20</w:t>
+              <w:t>24–26</w:t>
             </w:r>
           </w:p>
         </w:tc>
@@ -1059,12 +1065,14 @@
             <w:shd w:fill="F3F6F8"/>
           </w:tcPr>
           <w:p>
+            <w:pPr>
+              <w:spacing w:after="60" w:line="240" w:lineRule="auto"/>
+            </w:pPr>
             <w:r>
               <w:rPr>
-                <w:rFonts w:ascii="Calibri" w:hAnsi="Calibri"/>
-                <w:sz w:val="18"/>
+                <w:sz w:val="20"/>
               </w:rPr>
-              <w:t>21–26</w:t>
+              <w:t>27–32</w:t>
             </w:r>
           </w:p>
         </w:tc>
@@ -1179,7 +1187,7 @@
         </w:numPr>
       </w:pPr>
       <w:r>
-        <w:t>Open Analyses for sample-field requirements, instructions and expected outputs. Use Assembly for the Partner input, metadata and output profiles. Use PSeq kits for Partner offerings, effective negotiated prices, quantities and restrictions.</w:t>
+        <w:t>Open Analyses for sample-field requirements, instructions and expected outputs. Lab Service offerings binds reviewed analyses and allowed material/source groups to a catalog price, included outputs and published turnaround range. Publish a new offering version for changed terms. Use Assembly for input, metadata and output profiles, then bind the included Assembly profile in each active PSeq kit offering. Kit prices and destination restrictions remain Partner-specific.</w:t>
       </w:r>
     </w:p>
     <w:p>
@@ -1313,6 +1321,72 @@
     </w:p>
     <w:p>
       <w:pPr>
+        <w:pStyle w:val="Heading2"/>
+        <w:pageBreakBefore/>
+      </w:pPr>
+      <w:r>
+        <w:t>Review the configured offering</w:t>
+      </w:r>
+    </w:p>
+    <w:p>
+      <w:pPr/>
+      <w:r>
+        <w:t>This controlled version defines the scope offered for future standard Lab Service purchases. Existing commitments retain their accepted version.</w:t>
+      </w:r>
+    </w:p>
+    <w:p>
+      <w:pPr>
+        <w:keepNext/>
+        <w:spacing w:before="120" w:after="60"/>
+        <w:jc w:val="center"/>
+      </w:pPr>
+      <w:r/>
+      <w:r>
+        <w:drawing>
+          <wp:inline xmlns:a="http://schemas.openxmlformats.org/drawingml/2006/main" xmlns:pic="http://schemas.openxmlformats.org/drawingml/2006/picture">
+            <wp:extent cx="3840480" cy="5160645"/>
+            <wp:docPr id="12" name="Picture 12" descr="Lab Service offering version editor. This synthetic example shows scope, price-source and turnaround fields; saving or activating a real offering requires reviewed scientific configuration."/>
+            <wp:cNvGraphicFramePr>
+              <a:graphicFrameLocks noChangeAspect="1"/>
+            </wp:cNvGraphicFramePr>
+            <a:graphic>
+              <a:graphicData uri="http://schemas.openxmlformats.org/drawingml/2006/picture">
+                <pic:pic>
+                  <pic:nvPicPr>
+                    <pic:cNvPr id="0" name="lab-offering-version-detail.png"/>
+                    <pic:cNvPicPr/>
+                  </pic:nvPicPr>
+                  <pic:blipFill>
+                    <a:blip r:embed="rId21"/>
+                    <a:stretch>
+                      <a:fillRect/>
+                    </a:stretch>
+                  </pic:blipFill>
+                  <pic:spPr>
+                    <a:xfrm>
+                      <a:off x="0" y="0"/>
+                      <a:ext cx="3840480" cy="5160645"/>
+                    </a:xfrm>
+                    <a:prstGeom prst="rect"/>
+                  </pic:spPr>
+                </pic:pic>
+              </a:graphicData>
+            </a:graphic>
+          </wp:inline>
+        </w:drawing>
+      </w:r>
+    </w:p>
+    <w:p>
+      <w:pPr>
+        <w:pStyle w:val="Caption"/>
+        <w:keepNext w:val="0"/>
+      </w:pPr>
+      <w:r>
+        <w:t>Figure 2. Lab Service offering version editor. This synthetic example shows the upper scope and price-source fields; additional options continue below. A real offering requires reviewed scientific configuration.</w:t>
+      </w:r>
+    </w:p>
+    <w:p>
+      <w:pPr>
         <w:pStyle w:val="Heading1"/>
         <w:pageBreakBefore/>
       </w:pPr>
@@ -1468,7 +1542,7 @@
     </w:p>
     <w:p>
       <w:r>
-        <w:t>Commercial operators use Order Ops &gt; Order intake for each paid PSeq Job. This is the shared entry point for Customer-submitted requests, Phaeno-initiated pricing and approved CRM handoffs. There is no separate staging task to complete.</w:t>
+        <w:t>Commercial operators use Order Ops &gt; Order intake for per-Job commercial review, manual quotes and approved CRM handoffs. An entitled Customer or Partner organization administrator can place an eligible standard Lab Service Job directly after reviewing the configured total. There is no separate staging task to complete.</w:t>
       </w:r>
     </w:p>
     <w:p>
@@ -1520,7 +1594,7 @@
         <w:keepLines/>
       </w:pPr>
       <w:r>
-        <w:t>Figure 2. Order intake is the shared starting point for paid work. New Customer order opens the pricing request form.</w:t>
+        <w:t>Figure 3. Order intake is the staff workspace for commercial review and assisted work. New Customer order opens the manual pricing request form.</w:t>
       </w:r>
     </w:p>
     <w:p>
@@ -1637,7 +1711,7 @@
         <w:keepLines/>
       </w:pPr>
       <w:r>
-        <w:t>Figure 3. New Customer order captures the pricing scope before exact sample identifiers. This illustrative draft has not been saved; additional required fields continue below the visible form.</w:t>
+        <w:t>Figure 4. New Customer order captures the pricing scope before exact sample identifiers. This illustrative draft has not been saved; additional required fields continue below the visible form.</w:t>
       </w:r>
     </w:p>
     <w:p>
@@ -1885,12 +1959,124 @@
         <w:pageBreakBefore/>
       </w:pPr>
       <w:r>
-        <w:t>Issue the quote and finalize samples</w:t>
+        <w:t>Place a standard Lab Service order</w:t>
+      </w:r>
+    </w:p>
+    <w:p>
+      <w:pPr/>
+      <w:r>
+        <w:t>Eligible Customers and Partners can buy configured specimen processing and data assembly as one per-specimen product. An organization administrator makes this new standard commitment. Department administrators may prepare permitted drafts; the final commitment remains with the organization administrator.</w:t>
+      </w:r>
+    </w:p>
+    <w:p>
+      <w:pPr>
+        <w:pStyle w:val="ListNumber"/>
+      </w:pPr>
+      <w:r>
+        <w:t>Create or open the Lab Job draft. Describe the Job, material, biological-source groups and specimen counts, storage, safety and handling needs. Do not enter individual sample identifiers before commitment.</w:t>
+      </w:r>
+    </w:p>
+    <w:p>
+      <w:pPr>
+        <w:pStyle w:val="ListNumber"/>
+      </w:pPr>
+      <w:r>
+        <w:t>In Standard PSeq Lab Service, select an eligible offering. Review the included analyses and output scope, version, unit price, declared specimen quantity, calculated tax, final total and turnaround range. Approved billing and tax setup is required for this complete standard total.</w:t>
+      </w:r>
+    </w:p>
+    <w:p>
+      <w:pPr>
+        <w:pStyle w:val="ListNumber"/>
+      </w:pPr>
+      <w:r>
+        <w:t>Review the current server-calculated terms and required confirmation, then place the standard order. If the Job, price, scientific configuration or offering changed, refresh the review and confirm the new terms. An unsuccessful action retains the draft and creates no duplicate purchase.</w:t>
+      </w:r>
+    </w:p>
+    <w:p>
+      <w:pPr>
+        <w:pStyle w:val="ListNumber"/>
+      </w:pPr>
+      <w:r>
+        <w:t>After acceptance, open Samples and shipping and prepare the exact committed roster. Specimen-level Lab work starts only after finalization and the normal scientific intake checks.</w:t>
+      </w:r>
+    </w:p>
+    <w:p>
+      <w:pPr>
+        <w:keepNext/>
+        <w:spacing w:before="120" w:after="60"/>
+        <w:jc w:val="center"/>
+      </w:pPr>
+      <w:r/>
+      <w:r>
+        <w:drawing>
+          <wp:inline xmlns:a="http://schemas.openxmlformats.org/drawingml/2006/main" xmlns:pic="http://schemas.openxmlformats.org/drawingml/2006/picture">
+            <wp:extent cx="3931920" cy="4884182"/>
+            <wp:docPr id="13" name="Picture 13" descr="Standard Lab Service price confirmation. The organization administrator reviews quantity, included scope, tax and final total before placing the order. Amounts and identities are synthetic examples."/>
+            <wp:cNvGraphicFramePr>
+              <a:graphicFrameLocks noChangeAspect="1"/>
+            </wp:cNvGraphicFramePr>
+            <a:graphic>
+              <a:graphicData uri="http://schemas.openxmlformats.org/drawingml/2006/picture">
+                <pic:pic>
+                  <pic:nvPicPr>
+                    <pic:cNvPr id="0" name="lab-price-confirmation-detail.png"/>
+                    <pic:cNvPicPr/>
+                  </pic:nvPicPr>
+                  <pic:blipFill>
+                    <a:blip r:embed="rId22"/>
+                    <a:stretch>
+                      <a:fillRect/>
+                    </a:stretch>
+                  </pic:blipFill>
+                  <pic:spPr>
+                    <a:xfrm>
+                      <a:off x="0" y="0"/>
+                      <a:ext cx="3931920" cy="4884182"/>
+                    </a:xfrm>
+                    <a:prstGeom prst="rect"/>
+                  </pic:spPr>
+                </pic:pic>
+              </a:graphicData>
+            </a:graphic>
+          </wp:inline>
+        </w:drawing>
+      </w:r>
+    </w:p>
+    <w:p>
+      <w:pPr>
+        <w:pStyle w:val="Caption"/>
+        <w:keepNext w:val="0"/>
+      </w:pPr>
+      <w:r>
+        <w:t>Figure 5. Standard Lab Service price confirmation. The organization administrator reviews quantity, included scope, tax and final total before placing the order. Amounts and identities are synthetic examples.</w:t>
+      </w:r>
+    </w:p>
+    <w:p>
+      <w:pPr>
+        <w:pStyle w:val="Heading2"/>
+      </w:pPr>
+      <w:r>
+        <w:t>Request custom work when the standard scope does not fit</w:t>
+      </w:r>
+    </w:p>
+    <w:p>
+      <w:pPr/>
+      <w:r>
+        <w:t>Choose Request custom work from the Lab Job or Kit order. Give Sales a clear subject and description of the outcome needed. The submitted request returns a reference for the CRM Opportunity and preserves its Company and Department context. It does not place an executable order or approve a price. Sales qualification, the agreed scope and the approved handoff precede operational work.</w:t>
+      </w:r>
+    </w:p>
+    <w:p>
+      <w:pPr>
+        <w:pStyle w:val="Heading1"/>
+        <w:pageBreakBefore/>
+      </w:pPr>
+      <w:r>
+        <w:t>Review manual quotes and finalize samples</w:t>
       </w:r>
     </w:p>
     <w:p>
       <w:r>
-        <w:t>Commercial owns the quote; the Customer records acceptance and the exact sample roster. Organization administrators and authorized Department administrators can operate paid work in their permitted scope. Phaeno does not accept a quote on the Customer's behalf.</w:t>
+        <w:t>The existing manual quote path remains available for Customer requests and historical work. Commercial owns its quote; the authorized organization records acceptance. Organization administrators and permitted Department administrators can operate existing manual work. A configured standard order has already accepted its price and does not require this negotiation step.</w:t>
       </w:r>
     </w:p>
     <w:p>
@@ -2016,7 +2202,7 @@
         <w:pageBreakBefore/>
       </w:pPr>
       <w:r>
-        <w:t>Prepare ship and receive the samples</w:t>
+        <w:t>Prepare, ship and receive the samples</w:t>
       </w:r>
     </w:p>
     <w:p>
@@ -2152,7 +2338,7 @@
         <w:keepLines/>
       </w:pPr>
       <w:r>
-        <w:t>Figure 4. Scan shipment packet finds the expected shipment. Looking up a packet does not itself record custody, receipt or accession.</w:t>
+        <w:t>Figure 6. Scan shipment packet finds the expected shipment. Looking up a packet does not itself record custody, receipt or accession.</w:t>
       </w:r>
     </w:p>
     <w:p>
@@ -2225,8 +2411,80 @@
     </w:p>
     <w:p>
       <w:pPr>
+        <w:pStyle w:val="Heading2"/>
+        <w:pageBreakBefore/>
+      </w:pPr>
+      <w:r>
+        <w:t>Track the published turnaround</w:t>
+      </w:r>
+    </w:p>
+    <w:p>
+      <w:pPr/>
+      <w:r>
+        <w:t>A configured Lab offering's turnaround begins when Phaeno accepts each specimen. The order keeps its quoted range, original target, current expected date and actual completion; receipt-to-acceptance remains separate. The published range is an operating target unless the governing contract explicitly guarantees it.</w:t>
+      </w:r>
+    </w:p>
+    <w:p>
+      <w:pPr/>
+      <w:r>
+        <w:t>Authorized Lab operations staff can change the current expected completion date with a controlled customer-safe reason. Other operational delay also requires a safe explanatory note. A later date creates a notification to the ordering organization; an earlier date updates the Portal without a delay email. Internal notes remain separate, and notification failure does not undo the recorded timing change. The original target remains available for performance review.</w:t>
+      </w:r>
+    </w:p>
+    <w:p>
+      <w:pPr>
+        <w:keepNext/>
+        <w:spacing w:before="120" w:after="60"/>
+        <w:jc w:val="center"/>
+      </w:pPr>
+      <w:r/>
+      <w:r>
+        <w:drawing>
+          <wp:inline xmlns:a="http://schemas.openxmlformats.org/drawingml/2006/main" xmlns:pic="http://schemas.openxmlformats.org/drawingml/2006/picture">
+            <wp:extent cx="3794760" cy="4728627"/>
+            <wp:docPr id="14" name="Picture 14" descr="Update expected completion records the new date and a customer-safe reason. This synthetic dialog illustrates an unsaved change; a later date queues a notice after saving."/>
+            <wp:cNvGraphicFramePr>
+              <a:graphicFrameLocks noChangeAspect="1"/>
+            </wp:cNvGraphicFramePr>
+            <a:graphic>
+              <a:graphicData uri="http://schemas.openxmlformats.org/drawingml/2006/picture">
+                <pic:pic>
+                  <pic:nvPicPr>
+                    <pic:cNvPr id="0" name="lab-timing-override-detail.png"/>
+                    <pic:cNvPicPr/>
+                  </pic:nvPicPr>
+                  <pic:blipFill>
+                    <a:blip r:embed="rId23"/>
+                    <a:stretch>
+                      <a:fillRect/>
+                    </a:stretch>
+                  </pic:blipFill>
+                  <pic:spPr>
+                    <a:xfrm>
+                      <a:off x="0" y="0"/>
+                      <a:ext cx="3794760" cy="4728627"/>
+                    </a:xfrm>
+                    <a:prstGeom prst="rect"/>
+                  </pic:spPr>
+                </pic:pic>
+              </a:graphicData>
+            </a:graphic>
+          </wp:inline>
+        </w:drawing>
+      </w:r>
+    </w:p>
+    <w:p>
+      <w:pPr>
+        <w:pStyle w:val="Caption"/>
+        <w:keepNext w:val="0"/>
+      </w:pPr>
+      <w:r>
+        <w:t>Figure 7. Change expected completion records the new date and a customer-safe reason. This synthetic dialog illustrates an unsaved change; a later date queues a notice after saving.</w:t>
+      </w:r>
+    </w:p>
+    <w:p>
+      <w:pPr>
         <w:pStyle w:val="Heading1"/>
-        <w:pageBreakBefore w:val="0"/>
+        <w:pageBreakBefore/>
       </w:pPr>
       <w:r>
         <w:t>Configure and approve Trial scope</w:t>
@@ -2305,7 +2563,7 @@
         <w:keepLines/>
       </w:pPr>
       <w:r>
-        <w:t>Figure 5. Choose a primary approver and their approval responsibility. The note is optional; the illustrated assignment has not been saved.</w:t>
+        <w:t>Figure 8. Choose a primary approver and their approval responsibility. The note is optional; the illustrated assignment has not been saved.</w:t>
       </w:r>
     </w:p>
     <w:p>
@@ -2380,7 +2638,7 @@
         <w:keepLines/>
       </w:pPr>
       <w:r>
-        <w:t>Figure 6. The catalog lists deliverable names, formats and revisions. Default marks an initial default selection; this view displays the catalog without edit controls.</w:t>
+        <w:t>Figure 9. The catalog lists deliverable names, formats and revisions. Default marks an initial default selection; this view displays the catalog without edit controls.</w:t>
       </w:r>
     </w:p>
     <w:p>
@@ -2486,7 +2744,7 @@
         <w:keepLines/>
       </w:pPr>
       <w:r>
-        <w:t>Figure 7. This synthetic local example shows an incomplete Trial scope. Save draft retains staff work and leaves approvals unchanged; Submit scope for approval requires the completed scope.</w:t>
+        <w:t>Figure 10. This synthetic local example shows an incomplete Trial scope. Save draft retains staff work and leaves approvals unchanged; Submit scope for approval requires the completed scope.</w:t>
       </w:r>
     </w:p>
     <w:p>
@@ -2929,7 +3187,7 @@
         <w:keepLines/>
       </w:pPr>
       <w:r>
-        <w:t>Figure 8. Global retention policy changes apply to future releases. The form requires a change reason; existing package deadlines remain frozen.</w:t>
+        <w:t>Figure 11. Global retention policy changes apply to future releases. The form requires a change reason; existing package deadlines remain frozen.</w:t>
       </w:r>
     </w:p>
     <w:p>
@@ -3018,7 +3276,7 @@
     </w:p>
     <w:p>
       <w:r>
-        <w:t>Order Ops &gt; PSeq kits and Assembly owns Partner commitments, pricing, quotes, commercial holds and cancellation review. Lab Ops &gt; PSeq kits and Data assembly owns physical fulfillment, input validation, execution and output approval. Open Lab work retains the same order identity.</w:t>
+        <w:t>Order Ops &gt; PSeq kits owns the commercial purchase and its exceptions. Lab Ops &gt; PSeq kits and Data assembly owns physical fulfillment, intake, processing and output approval. Each new purchased Kit unit includes one Assembly case under that same commercial order. Historical reagent and standalone Assembly records retain their existing workflow.</w:t>
       </w:r>
     </w:p>
     <w:p>
@@ -3038,7 +3296,7 @@
         </w:numPr>
       </w:pPr>
       <w:r>
-        <w:t>The Partner chooses Create reagent order. Save draft retains the selected lines, purchase-order reference, shipping address, requested delivery date and instructions. An incomplete draft can be saved; placement requires the necessary purchase-order and delivery facts.</w:t>
+        <w:t>The Partner prepares a Kit order using its active negotiated offerings. Review the included Assembly profile and submission deadline rule with each line. Use whole Kit units, up to 1,000 per standard order; request custom work for another scope or quantity. Save draft retains the purchase-order reference, address, delivery preference and instructions.</w:t>
       </w:r>
     </w:p>
     <w:p>
@@ -3050,7 +3308,7 @@
         </w:numPr>
       </w:pPr>
       <w:r>
-        <w:t>At placement, POMS checks the active Partner offering, effective negotiated price, currency, quantity rules and destination restrictions and preserves the commercial snapshot.</w:t>
+        <w:t>An organization administrator reviews and places the order. POMS checks the effective offering, price, profile version, whole quantity and destination restrictions. Saving refreshed terms may require another review before placement. Successful placement freezes the reviewed scope and creates exactly one individually identified unit and included Assembly case per purchased Kit.</w:t>
       </w:r>
     </w:p>
     <w:p>
@@ -3074,7 +3332,7 @@
         </w:numPr>
       </w:pPr>
       <w:r>
-        <w:t>Record any proposed substitution explicitly. The Partner administrator approves it; an increased total also needs the required commercial approval. Keep backorders attached to the original order.</w:t>
+        <w:t>Record substitutions explicitly and obtain the existing required approvals. A Kit substitution must preserve its purchased Assembly scope. Use the audited Replace Kit action for a damaged or defective shipped unit; this transfers its existing case, preserves the original purchase and billing links, and retains earlier input provenance without creating another entitlement.</w:t>
       </w:r>
     </w:p>
     <w:p>
@@ -3086,20 +3344,71 @@
         </w:numPr>
       </w:pPr>
       <w:r>
-        <w:t>Record partial or full shipments with line quantities, lot or batch, applicable expiry, carrier, tracking, ship date and packing-slip facts. Preserve shipped quantities and resolve the remainder through later shipment or adjustment records.</w:t>
+        <w:t>Record partial or full shipments with whole line quantities, lot or batch, applicable expiry, carrier, tracking and ship date. POMS assigns the shipped purchased units. Each included case receives its own submission deadline: labeled expiry plus 90 days, or 12 months after shipment when there is no recorded expiry.</w:t>
       </w:r>
     </w:p>
     <w:p>
       <w:r>
-        <w:t>Each shipment creates its own accounting source. Partner kit invoicing, tax treatment and posting follow the separate accounting handoff; they do not become native PSeq Customer invoices automatically.</w:t>
+        <w:t>Each shipment creates its accounting source for the shipped Kit bundle quantities. Included Assembly preparation, processing and output approval create no additional quote, invoice or CRM sale. Partner Kit accounting remains the existing separate handoff; it does not become a native Lab Service invoice automatically.</w:t>
       </w:r>
     </w:p>
     <w:p>
       <w:pPr>
+        <w:keepNext/>
+        <w:spacing w:before="120" w:after="60"/>
+        <w:jc w:val="center"/>
+      </w:pPr>
+      <w:r/>
+      <w:r>
+        <w:drawing>
+          <wp:inline xmlns:a="http://schemas.openxmlformats.org/drawingml/2006/main" xmlns:pic="http://schemas.openxmlformats.org/drawingml/2006/picture">
+            <wp:extent cx="5715000" cy="3798744"/>
+            <wp:docPr id="15" name="Picture 15" descr="The purchased Kit order lists its included Assembly case and current physical unit. Prepare inputs opens that same case; it does not purchase another Assembly service. This is synthetic example data."/>
+            <wp:cNvGraphicFramePr>
+              <a:graphicFrameLocks noChangeAspect="1"/>
+            </wp:cNvGraphicFramePr>
+            <a:graphic>
+              <a:graphicData uri="http://schemas.openxmlformats.org/drawingml/2006/picture">
+                <pic:pic>
+                  <pic:nvPicPr>
+                    <pic:cNvPr id="0" name="kit-included-case-detail.png"/>
+                    <pic:cNvPicPr/>
+                  </pic:nvPicPr>
+                  <pic:blipFill>
+                    <a:blip r:embed="rId24"/>
+                    <a:stretch>
+                      <a:fillRect/>
+                    </a:stretch>
+                  </pic:blipFill>
+                  <pic:spPr>
+                    <a:xfrm>
+                      <a:off x="0" y="0"/>
+                      <a:ext cx="5715000" cy="3798744"/>
+                    </a:xfrm>
+                    <a:prstGeom prst="rect"/>
+                  </pic:spPr>
+                </pic:pic>
+              </a:graphicData>
+            </a:graphic>
+          </wp:inline>
+        </w:drawing>
+      </w:r>
+    </w:p>
+    <w:p>
+      <w:pPr>
+        <w:pStyle w:val="Caption"/>
+        <w:keepNext w:val="0"/>
+      </w:pPr>
+      <w:r>
+        <w:t>Figure 12. The purchased Kit order lists its included Assembly case and current physical unit. Prepare inputs opens that same case; it does not purchase another Assembly service. This is synthetic example data.</w:t>
+      </w:r>
+    </w:p>
+    <w:p>
+      <w:pPr>
         <w:pStyle w:val="Heading2"/>
       </w:pPr>
       <w:r>
-        <w:t>Data Assembly requests</w:t>
+        <w:t>Prepare each included Assembly case</w:t>
       </w:r>
     </w:p>
     <w:p>
@@ -3111,7 +3420,7 @@
         </w:numPr>
       </w:pPr>
       <w:r>
-        <w:t>The Partner selects an active Assembly profile, completes its project metadata and attaches allowed inputs. The form shows current file-type and size limits. Save draft preserves the request.</w:t>
+        <w:t>Open the purchased Kit order and select Prepare inputs on its available Assembly case. The request inherits the purchased profile, allowed file kinds and size limits, included output scope and purchase reference. Complete the project metadata and attach the allowed inputs. New standalone Assembly purchase is replaced by this case-scoped path.</w:t>
       </w:r>
     </w:p>
     <w:p>
@@ -3135,7 +3444,7 @@
         </w:numPr>
       </w:pPr>
       <w:r>
-        <w:t>Lab Ops &gt; Data assembly validates input. Commercial issues the linked per-job quote after input acceptance. Partner acceptance queues manufacturing against the accepted input and profile.</w:t>
+        <w:t>Lab Ops &gt; Data assembly validates the submitted inputs. Accepting intake queues included Assembly processing directly. The purchased Kit already owns the commercial commitment, so there is no second quote to issue or accept. Historical standalone requests retain their original quote workflow.</w:t>
       </w:r>
     </w:p>
     <w:p>
@@ -3152,7 +3461,135 @@
     </w:p>
     <w:p>
       <w:r>
-        <w:t>An interrupted upload, submission or placement can leave a saved draft. Use Open saved draft and retry the original record; successful earlier stages are retained. Assembly output approval creates its accounting source. Approved Assembly credit permits release under its terms; otherwise payment hold remains in force. PSeq Customer payment-independent release rules do not remove the Partner gate.</w:t>
+        <w:t>An interrupted upload or submission may leave a saved draft. Open the same case and retry; earlier successful work is retained. Result approval checks the original Kit shipment billing balance and the organization's Assembly credit decision. The Partner payment gate remains separate from the payment-independent Lab Service release policy.</w:t>
+      </w:r>
+    </w:p>
+    <w:p>
+      <w:pPr>
+        <w:keepNext/>
+        <w:spacing w:before="120" w:after="60"/>
+        <w:jc w:val="center"/>
+      </w:pPr>
+      <w:r/>
+      <w:r>
+        <w:drawing>
+          <wp:inline xmlns:a="http://schemas.openxmlformats.org/drawingml/2006/main" xmlns:pic="http://schemas.openxmlformats.org/drawingml/2006/picture">
+            <wp:extent cx="6035040" cy="2131943"/>
+            <wp:docPr id="16" name="Picture 16" descr="Included Assembly preparation retains the parent Kit and frozen purchased scope. The profile and outputs are inherited from the purchase."/>
+            <wp:cNvGraphicFramePr>
+              <a:graphicFrameLocks noChangeAspect="1"/>
+            </wp:cNvGraphicFramePr>
+            <a:graphic>
+              <a:graphicData uri="http://schemas.openxmlformats.org/drawingml/2006/picture">
+                <pic:pic>
+                  <pic:nvPicPr>
+                    <pic:cNvPr id="0" name="kit-assembly-inputs-scope.png"/>
+                    <pic:cNvPicPr/>
+                  </pic:nvPicPr>
+                  <pic:blipFill>
+                    <a:blip r:embed="rId25"/>
+                    <a:stretch>
+                      <a:fillRect/>
+                    </a:stretch>
+                  </pic:blipFill>
+                  <pic:spPr>
+                    <a:xfrm>
+                      <a:off x="0" y="0"/>
+                      <a:ext cx="6035040" cy="2131943"/>
+                    </a:xfrm>
+                    <a:prstGeom prst="rect"/>
+                  </pic:spPr>
+                </pic:pic>
+              </a:graphicData>
+            </a:graphic>
+          </wp:inline>
+        </w:drawing>
+      </w:r>
+    </w:p>
+    <w:p>
+      <w:pPr>
+        <w:pStyle w:val="Caption"/>
+        <w:keepNext w:val="0"/>
+      </w:pPr>
+      <w:r>
+        <w:t>Figure 13. Included Assembly preparation retains the frozen purchased profile and outputs. These terms are inherited from the purchased Kit case.</w:t>
+      </w:r>
+    </w:p>
+    <w:p>
+      <w:pPr>
+        <w:keepNext/>
+        <w:spacing w:before="120" w:after="60"/>
+        <w:jc w:val="center"/>
+      </w:pPr>
+      <w:r/>
+      <w:r>
+        <w:drawing>
+          <wp:inline xmlns:a="http://schemas.openxmlformats.org/drawingml/2006/main" xmlns:pic="http://schemas.openxmlformats.org/drawingml/2006/picture">
+            <wp:extent cx="6035040" cy="2755126"/>
+            <wp:docPr id="17" name="Picture 17" descr="Add input files in the same included case. An interrupted upload can be retried while successful files and the draft remain available. The depicted files and identifiers are synthetic."/>
+            <wp:cNvGraphicFramePr>
+              <a:graphicFrameLocks noChangeAspect="1"/>
+            </wp:cNvGraphicFramePr>
+            <a:graphic>
+              <a:graphicData uri="http://schemas.openxmlformats.org/drawingml/2006/picture">
+                <pic:pic>
+                  <pic:nvPicPr>
+                    <pic:cNvPr id="0" name="kit-assembly-inputs-files.png"/>
+                    <pic:cNvPicPr/>
+                  </pic:nvPicPr>
+                  <pic:blipFill>
+                    <a:blip r:embed="rId26"/>
+                    <a:stretch>
+                      <a:fillRect/>
+                    </a:stretch>
+                  </pic:blipFill>
+                  <pic:spPr>
+                    <a:xfrm>
+                      <a:off x="0" y="0"/>
+                      <a:ext cx="6035040" cy="2755126"/>
+                    </a:xfrm>
+                    <a:prstGeom prst="rect"/>
+                  </pic:spPr>
+                </pic:pic>
+              </a:graphicData>
+            </a:graphic>
+          </wp:inline>
+        </w:drawing>
+      </w:r>
+    </w:p>
+    <w:p>
+      <w:pPr>
+        <w:pStyle w:val="Caption"/>
+        <w:keepNext w:val="0"/>
+      </w:pPr>
+      <w:r>
+        <w:t>Figure 14. Add input files in the same included case. An interrupted upload can be retried while successful files and the draft remain available. The depicted files and identifiers are synthetic.</w:t>
+      </w:r>
+    </w:p>
+    <w:p>
+      <w:pPr>
+        <w:pStyle w:val="Heading2"/>
+      </w:pPr>
+      <w:r>
+        <w:t>Resolve deadlines and finish the Kit order</w:t>
+      </w:r>
+    </w:p>
+    <w:p>
+      <w:pPr/>
+      <w:r>
+        <w:t>Cases can be submitted independently. Once first submitted, corrections reuse the same case and retain immutable input revisions; they do not consume another entitlement. An unused case past its deadline cannot accept new inputs. Authorized Phaeno staff may grant a later deadline with a reason; saved input preparation remains linked to that case.</w:t>
+      </w:r>
+    </w:p>
+    <w:p>
+      <w:pPr/>
+      <w:r>
+        <w:t>Cancel an unused case with a reason, or use the Assembly cancellation workflow for submitted work. An unused or expired entitlement does not automatically refund or credit the bundle. Any financial adjustment follows the approved commercial exception process.</w:t>
+      </w:r>
+    </w:p>
+    <w:p>
+      <w:pPr/>
+      <w:r>
+        <w:t>After physical fulfillment, the order remains Kit fulfilled / assembly pending while any case is open. It becomes Completed when every case has released results, expired unused or been formally cancelled. Downloading a report does not confirm payment or create a new completion event.</w:t>
       </w:r>
     </w:p>
     <w:p>
@@ -3267,7 +3704,7 @@
         <w:pageBreakBefore/>
       </w:pPr>
       <w:r>
-        <w:t>Record import and allocate receipts</w:t>
+        <w:t>Record, import and allocate receipts</w:t>
       </w:r>
     </w:p>
     <w:p>
@@ -3368,7 +3805,7 @@
         <w:keepLines/>
       </w:pPr>
       <w:r>
-        <w:t>Figure 9. Record receipt captures one bank event and its evidence. This blank form has not recorded or allocated any money.</w:t>
+        <w:t>Figure 15. Record receipt captures one bank event and its evidence. This blank form has not recorded or allocated any money.</w:t>
       </w:r>
     </w:p>
     <w:p>
@@ -3443,7 +3880,7 @@
         <w:keepLines/>
       </w:pPr>
       <w:r>
-        <w:t>Figure 10. Import receipts starts with a Customer, source and CSV file or pasted content. Preview import prepares the review; it does not yet create receipts.</w:t>
+        <w:t>Figure 16. Import receipts starts with a Customer, source and CSV file or pasted content. Preview import prepares the review; it does not yet create receipts.</w:t>
       </w:r>
     </w:p>
     <w:p>
@@ -3608,7 +4045,7 @@
         <w:keepLines/>
       </w:pPr>
       <w:r>
-        <w:t>Figure 11. New reconciliation requires eligible recorded receipts. This example has none, so a batch cannot yet be created.</w:t>
+        <w:t>Figure 17. New reconciliation requires eligible recorded receipts. This example has none, so a batch cannot yet be created.</w:t>
       </w:r>
     </w:p>
     <w:p>
@@ -3717,6 +4154,12 @@
       </w:pPr>
       <w:r>
         <w:t>Complete the missing step in that same record. Keep approved requests visible until fulfillment and completion, and retain failed drafts for correction rather than starting another order.</w:t>
+      </w:r>
+    </w:p>
+    <w:p>
+      <w:pPr/>
+      <w:r>
+        <w:t>Platform administrators can use Order Ops &gt; Attention &gt; CRM sale summaries to retry a failed publication after correcting its cause. The committed order remains valid while its summary awaits CRM publication. Retry publication reuses that summary and never places another order.</w:t>
       </w:r>
     </w:p>
     <w:p>

</xml_diff>